<commit_message>
Redactar el manual en un registro más formal y sin detalle técnico
- La introducción presenta la aplicación como un complemento de la matriz
  de control, no como su sustituto.
- Se retira toda referencia al cifrado y demás detalle técnico: el manual
  explica el uso, no el funcionamiento interno.
- Se revisa la redacción de todos los apartados para darle un tono formal
  y más conciso, tratando al lector de usted de forma uniforme.
- Cabeceras de tabla más claras: Observaciones y Quién la visualiza.

Co-Authored-By: Claude Opus 5 <noreply@anthropic.com>
Claude-Session: https://claude.ai/code/session_01XEwTjjddaCrigujsJqRUu1
</commit_message>
<xml_diff>
--- a/Manual de usuario - Control de Oficios.docx
+++ b/Manual de usuario - Control de Oficios.docx
@@ -1430,7 +1430,7 @@
           <w:sz w:val="22"/>
           <w:szCs w:val="22"/>
         </w:rPr>
-        <w:t xml:space="preserve">Control de Oficios es la aplicación de la Unidad de Cumplimiento para registrar y hacer seguimiento a los oficios y circulares que llegan al área. Sustituye al archivo Excel que se venía usando y conserva la numeración desde el último oficio registrado en él.</w:t>
+        <w:t xml:space="preserve">Control de Oficios es la aplicación de la Unidad de Cumplimiento para registrar y dar seguimiento a los oficios y circulares que recibe el área.</w:t>
       </w:r>
     </w:p>
     <w:p>
@@ -1444,7 +1444,7 @@
           <w:sz w:val="22"/>
           <w:szCs w:val="22"/>
         </w:rPr>
-        <w:t xml:space="preserve">Toda la información se guarda cifrada y cada acción que modifica datos queda registrada en una bitácora de auditoría.</w:t>
+        <w:t xml:space="preserve">Constituye un complemento de la matriz de control que se venía utilizando: centraliza el registro, asigna la numeración de forma automática y permite consultar en cualquier momento la situación de cada requerimiento.</w:t>
       </w:r>
     </w:p>
     <w:p>
@@ -1478,7 +1478,7 @@
           <w:sz w:val="22"/>
           <w:szCs w:val="22"/>
         </w:rPr>
-        <w:t xml:space="preserve">Lo que cada persona puede hacer depende de su rol. Este manual está organizado de menor a mayor alcance: cada rol incluye todo lo del anterior y añade sus propias funciones.</w:t>
+        <w:t xml:space="preserve">Las funciones disponibles dependen del rol asignado a cada cuenta. Este manual se ha ordenado de menor a mayor alcance: cada rol comprende las funciones del anterior y añade las propias.</w:t>
       </w:r>
     </w:p>
     <w:tbl>
@@ -1617,7 +1617,7 @@
                 <w:sz w:val="20"/>
                 <w:szCs w:val="20"/>
               </w:rPr>
-              <w:t xml:space="preserve">Registra y atiende sus propios oficios</w:t>
+              <w:t xml:space="preserve">Registra y atiende los oficios a su cargo</w:t>
             </w:r>
           </w:p>
         </w:tc>
@@ -1677,7 +1677,7 @@
                 <w:sz w:val="20"/>
                 <w:szCs w:val="20"/>
               </w:rPr>
-              <w:t xml:space="preserve">Todo lo anterior + gestiona todos los oficios y a los usuarios</w:t>
+              <w:t xml:space="preserve">Lo anterior, más la gestión de todos los oficios y de las cuentas</w:t>
             </w:r>
           </w:p>
         </w:tc>
@@ -1737,7 +1737,7 @@
                 <w:sz w:val="20"/>
                 <w:szCs w:val="20"/>
               </w:rPr>
-              <w:t xml:space="preserve">Todo lo anterior + crea administradores y controla las copias de seguridad</w:t>
+              <w:t xml:space="preserve">Lo anterior, más la creación de administradores y las copias de seguridad</w:t>
             </w:r>
           </w:p>
         </w:tc>
@@ -1800,7 +1800,7 @@
                 <w:sz w:val="22"/>
                 <w:szCs w:val="22"/>
               </w:rPr>
-              <w:t xml:space="preserve">el primer usuario que se crea al instalar la aplicación es siempre el superusuario y no puede eliminarse.</w:t>
+              <w:t xml:space="preserve">la primera cuenta que se crea al instalar la aplicación corresponde al superusuario y no puede eliminarse.</w:t>
             </w:r>
           </w:p>
         </w:tc>
@@ -1881,7 +1881,7 @@
           <w:sz w:val="22"/>
           <w:szCs w:val="22"/>
         </w:rPr>
-        <w:t xml:space="preserve">Escriba su usuario y su contraseña.</w:t>
+        <w:t xml:space="preserve">Indique su usuario y su contraseña.</w:t>
       </w:r>
     </w:p>
     <w:p>
@@ -1914,7 +1914,7 @@
           <w:sz w:val="22"/>
           <w:szCs w:val="22"/>
         </w:rPr>
-        <w:t xml:space="preserve">Si es la primera vez que se usa la aplicación en el equipo, la pantalla pedirá crear la cuenta de superusuario en lugar de pedir el ingreso.</w:t>
+        <w:t xml:space="preserve">Cuando la aplicación se utiliza por primera vez, la pantalla inicial solicita crear la cuenta de superusuario en lugar del ingreso habitual.</w:t>
       </w:r>
     </w:p>
     <w:p>
@@ -1948,7 +1948,7 @@
           <w:sz w:val="22"/>
           <w:szCs w:val="22"/>
         </w:rPr>
-        <w:t xml:space="preserve">Cualquier persona, sea cual sea su rol, puede cambiar su contraseña sin ayuda de nadie:</w:t>
+        <w:t xml:space="preserve">Todo usuario puede modificar su contraseña por sí mismo, con independencia de su rol:</w:t>
       </w:r>
     </w:p>
     <w:p>
@@ -1967,7 +1967,7 @@
           <w:sz w:val="22"/>
           <w:szCs w:val="22"/>
         </w:rPr>
-        <w:t xml:space="preserve">Pulse Cambiar contraseña, en la cabecera azul.</w:t>
+        <w:t xml:space="preserve">Pulse Cambiar contraseña, en la cabecera de la ventana.</w:t>
       </w:r>
     </w:p>
     <w:p>
@@ -1986,7 +1986,7 @@
           <w:sz w:val="22"/>
           <w:szCs w:val="22"/>
         </w:rPr>
-        <w:t xml:space="preserve">Escriba su contraseña actual.</w:t>
+        <w:t xml:space="preserve">Indique su contraseña actual.</w:t>
       </w:r>
     </w:p>
     <w:p>
@@ -2070,7 +2070,7 @@
                 <w:sz w:val="22"/>
                 <w:szCs w:val="22"/>
               </w:rPr>
-              <w:t xml:space="preserve">¿Por qué pide la contraseña actual?  </w:t>
+              <w:t xml:space="preserve">¿Por qué se solicita la contraseña actual?  </w:t>
             </w:r>
             <w:r>
               <w:rPr>
@@ -2079,7 +2079,7 @@
                 <w:sz w:val="22"/>
                 <w:szCs w:val="22"/>
               </w:rPr>
-              <w:t xml:space="preserve">Para que nadie que encuentre su sesión abierta pueda cambiarla y dejarlo fuera del sistema.</w:t>
+              <w:t xml:space="preserve">Es una medida de seguridad: impide que un tercero la modifique si la sesión queda abierta.</w:t>
             </w:r>
           </w:p>
         </w:tc>
@@ -2101,7 +2101,7 @@
           <w:sz w:val="22"/>
           <w:szCs w:val="22"/>
         </w:rPr>
-        <w:t xml:space="preserve">Si olvidó su contraseña y no puede ingresar, pida a un administrador o al superusuario que se la restablezca (ver el apartado 4.3).</w:t>
+        <w:t xml:space="preserve">Si ha olvidado su contraseña y no puede ingresar, solicite su restablecimiento a un administrador o al superusuario (apartado 4.3).</w:t>
       </w:r>
     </w:p>
     <w:p>
@@ -2135,7 +2135,7 @@
           <w:sz w:val="22"/>
           <w:szCs w:val="22"/>
         </w:rPr>
-        <w:t xml:space="preserve">Pulse Cerrar sesión en la cabecera y confirme. La aplicación vuelve a la pantalla de ingreso y otra persona puede entrar con su propio usuario.</w:t>
+        <w:t xml:space="preserve">Pulse Cerrar sesión en la cabecera y confirme la operación. La aplicación regresa a la pantalla de ingreso, de modo que otra persona pueda acceder con su propia cuenta.</w:t>
       </w:r>
     </w:p>
     <w:p>
@@ -2172,8 +2172,8 @@
       </w:tblPr>
       <w:tblGrid>
         <w:gridCol w:w="2400"/>
-        <w:gridCol w:w="4560"/>
-        <w:gridCol w:w="2400"/>
+        <w:gridCol w:w="4360"/>
+        <w:gridCol w:w="2600"/>
       </w:tblGrid>
       <w:tr>
         <w:trPr>
@@ -2211,7 +2211,7 @@
         </w:tc>
         <w:tc>
           <w:tcPr>
-            <w:tcW w:type="dxa" w:w="4560"/>
+            <w:tcW w:type="dxa" w:w="4360"/>
             <w:shd w:fill="152342" w:val="clear"/>
             <w:tcMar>
               <w:top w:type="dxa" w:w="80"/>
@@ -2235,13 +2235,13 @@
                 <w:sz w:val="20"/>
                 <w:szCs w:val="20"/>
               </w:rPr>
-              <w:t xml:space="preserve">Para qué sirve</w:t>
-            </w:r>
-          </w:p>
-        </w:tc>
-        <w:tc>
-          <w:tcPr>
-            <w:tcW w:type="dxa" w:w="2400"/>
+              <w:t xml:space="preserve">Función</w:t>
+            </w:r>
+          </w:p>
+        </w:tc>
+        <w:tc>
+          <w:tcPr>
+            <w:tcW w:type="dxa" w:w="2600"/>
             <w:shd w:fill="152342" w:val="clear"/>
             <w:tcMar>
               <w:top w:type="dxa" w:w="80"/>
@@ -2265,7 +2265,7 @@
                 <w:sz w:val="20"/>
                 <w:szCs w:val="20"/>
               </w:rPr>
-              <w:t xml:space="preserve">Quién la ve</w:t>
+              <w:t xml:space="preserve">Quién la visualiza</w:t>
             </w:r>
           </w:p>
         </w:tc>
@@ -2303,7 +2303,7 @@
         </w:tc>
         <w:tc>
           <w:tcPr>
-            <w:tcW w:type="dxa" w:w="4560"/>
+            <w:tcW w:type="dxa" w:w="4360"/>
             <w:shd w:fill="FFFFFF" w:val="clear"/>
             <w:tcMar>
               <w:top w:type="dxa" w:w="80"/>
@@ -2325,13 +2325,13 @@
                 <w:sz w:val="20"/>
                 <w:szCs w:val="20"/>
               </w:rPr>
-              <w:t xml:space="preserve">Dar de alta un oficio nuevo</w:t>
-            </w:r>
-          </w:p>
-        </w:tc>
-        <w:tc>
-          <w:tcPr>
-            <w:tcW w:type="dxa" w:w="2400"/>
+              <w:t xml:space="preserve">Alta de un oficio nuevo</w:t>
+            </w:r>
+          </w:p>
+        </w:tc>
+        <w:tc>
+          <w:tcPr>
+            <w:tcW w:type="dxa" w:w="2600"/>
             <w:shd w:fill="FFFFFF" w:val="clear"/>
             <w:tcMar>
               <w:top w:type="dxa" w:w="80"/>
@@ -2391,7 +2391,7 @@
         </w:tc>
         <w:tc>
           <w:tcPr>
-            <w:tcW w:type="dxa" w:w="4560"/>
+            <w:tcW w:type="dxa" w:w="4360"/>
             <w:shd w:fill="F7F8FA" w:val="clear"/>
             <w:tcMar>
               <w:top w:type="dxa" w:w="80"/>
@@ -2413,13 +2413,13 @@
                 <w:sz w:val="20"/>
                 <w:szCs w:val="20"/>
               </w:rPr>
-              <w:t xml:space="preserve">Buscar, consultar y modificar oficios</w:t>
-            </w:r>
-          </w:p>
-        </w:tc>
-        <w:tc>
-          <w:tcPr>
-            <w:tcW w:type="dxa" w:w="2400"/>
+              <w:t xml:space="preserve">Consulta y modificación de oficios</w:t>
+            </w:r>
+          </w:p>
+        </w:tc>
+        <w:tc>
+          <w:tcPr>
+            <w:tcW w:type="dxa" w:w="2600"/>
             <w:shd w:fill="F7F8FA" w:val="clear"/>
             <w:tcMar>
               <w:top w:type="dxa" w:w="80"/>
@@ -2479,7 +2479,7 @@
         </w:tc>
         <w:tc>
           <w:tcPr>
-            <w:tcW w:type="dxa" w:w="4560"/>
+            <w:tcW w:type="dxa" w:w="4360"/>
             <w:shd w:fill="FFFFFF" w:val="clear"/>
             <w:tcMar>
               <w:top w:type="dxa" w:w="80"/>
@@ -2507,7 +2507,7 @@
         </w:tc>
         <w:tc>
           <w:tcPr>
-            <w:tcW w:type="dxa" w:w="2400"/>
+            <w:tcW w:type="dxa" w:w="2600"/>
             <w:shd w:fill="FFFFFF" w:val="clear"/>
             <w:tcMar>
               <w:top w:type="dxa" w:w="80"/>
@@ -2567,7 +2567,7 @@
         </w:tc>
         <w:tc>
           <w:tcPr>
-            <w:tcW w:type="dxa" w:w="4560"/>
+            <w:tcW w:type="dxa" w:w="4360"/>
             <w:shd w:fill="F7F8FA" w:val="clear"/>
             <w:tcMar>
               <w:top w:type="dxa" w:w="80"/>
@@ -2589,13 +2589,13 @@
                 <w:sz w:val="20"/>
                 <w:szCs w:val="20"/>
               </w:rPr>
-              <w:t xml:space="preserve">Crear y gestionar cuentas</w:t>
-            </w:r>
-          </w:p>
-        </w:tc>
-        <w:tc>
-          <w:tcPr>
-            <w:tcW w:type="dxa" w:w="2400"/>
+              <w:t xml:space="preserve">Administración de cuentas</w:t>
+            </w:r>
+          </w:p>
+        </w:tc>
+        <w:tc>
+          <w:tcPr>
+            <w:tcW w:type="dxa" w:w="2600"/>
             <w:shd w:fill="F7F8FA" w:val="clear"/>
             <w:tcMar>
               <w:top w:type="dxa" w:w="80"/>
@@ -2655,7 +2655,7 @@
         </w:tc>
         <w:tc>
           <w:tcPr>
-            <w:tcW w:type="dxa" w:w="4560"/>
+            <w:tcW w:type="dxa" w:w="4360"/>
             <w:shd w:fill="FFFFFF" w:val="clear"/>
             <w:tcMar>
               <w:top w:type="dxa" w:w="80"/>
@@ -2683,7 +2683,7 @@
         </w:tc>
         <w:tc>
           <w:tcPr>
-            <w:tcW w:type="dxa" w:w="2400"/>
+            <w:tcW w:type="dxa" w:w="2600"/>
             <w:shd w:fill="FFFFFF" w:val="clear"/>
             <w:tcMar>
               <w:top w:type="dxa" w:w="80"/>
@@ -2747,7 +2747,7 @@
           <w:sz w:val="22"/>
           <w:szCs w:val="22"/>
         </w:rPr>
-        <w:t xml:space="preserve">El usuario registra los oficios que le corresponden y les da seguimiento hasta finalizarlos.</w:t>
+        <w:t xml:space="preserve">El usuario registra los oficios que le corresponden y les da seguimiento hasta su finalización.</w:t>
       </w:r>
     </w:p>
     <w:tbl>
@@ -2793,7 +2793,7 @@
                 <w:sz w:val="22"/>
                 <w:szCs w:val="22"/>
               </w:rPr>
-              <w:t xml:space="preserve">Qué ve un usuario:  </w:t>
+              <w:t xml:space="preserve">Alcance de la consulta:  </w:t>
             </w:r>
             <w:r>
               <w:rPr>
@@ -2802,7 +2802,7 @@
                 <w:sz w:val="22"/>
                 <w:szCs w:val="22"/>
               </w:rPr>
-              <w:t xml:space="preserve">únicamente los oficios que él registró o que tiene asignados. No ve los del resto del equipo.</w:t>
+              <w:t xml:space="preserve">el usuario visualiza únicamente los oficios que ha registrado o que tiene asignados; no accede a los del resto del equipo.</w:t>
             </w:r>
           </w:p>
         </w:tc>
@@ -2839,7 +2839,7 @@
           <w:sz w:val="22"/>
           <w:szCs w:val="22"/>
         </w:rPr>
-        <w:t xml:space="preserve">En la pestaña Registrar oficio complete el formulario. Los campos con asterisco (*) son obligatorios.</w:t>
+        <w:t xml:space="preserve">En la pestaña Registrar oficio complete el formulario. Los campos señalados con asterisco (*) son obligatorios.</w:t>
       </w:r>
     </w:p>
     <w:tbl>
@@ -2949,7 +2949,7 @@
                 <w:sz w:val="20"/>
                 <w:szCs w:val="20"/>
               </w:rPr>
-              <w:t xml:space="preserve">Notas</w:t>
+              <w:t xml:space="preserve">Observaciones</w:t>
             </w:r>
           </w:p>
         </w:tc>
@@ -3037,7 +3037,7 @@
                 <w:sz w:val="20"/>
                 <w:szCs w:val="20"/>
               </w:rPr>
-              <w:t xml:space="preserve">No puede repetirse</w:t>
+              <w:t xml:space="preserve">No admite duplicados</w:t>
             </w:r>
           </w:p>
         </w:tc>
@@ -3477,7 +3477,7 @@
                 <w:sz w:val="20"/>
                 <w:szCs w:val="20"/>
               </w:rPr>
-              <w:t xml:space="preserve">Si la indica, el oficio se finaliza</w:t>
+              <w:t xml:space="preserve">Al indicarla, el oficio se finaliza</w:t>
             </w:r>
           </w:p>
         </w:tc>
@@ -3565,7 +3565,7 @@
                 <w:sz w:val="20"/>
                 <w:szCs w:val="20"/>
               </w:rPr>
-              <w:t xml:space="preserve">Es usted; se asigna solo</w:t>
+              <w:t xml:space="preserve">Se asigna automáticamente al usuario</w:t>
             </w:r>
           </w:p>
         </w:tc>
@@ -3741,7 +3741,7 @@
                 <w:sz w:val="20"/>
                 <w:szCs w:val="20"/>
               </w:rPr>
-              <w:t xml:space="preserve">Se puede editar después</w:t>
+              <w:t xml:space="preserve">Puede modificarse posteriormente</w:t>
             </w:r>
           </w:p>
         </w:tc>
@@ -3763,7 +3763,7 @@
           <w:sz w:val="22"/>
           <w:szCs w:val="22"/>
         </w:rPr>
-        <w:t xml:space="preserve">Al guardar, el sistema asigna automáticamente la Referencia UDC, con el formato REQ-INF-año-número (por ejemplo REQ-INF-2026-0242). Esa referencia no se escribe a mano y no se repite nunca.</w:t>
+        <w:t xml:space="preserve">Al guardar, la aplicación asigna automáticamente la Referencia UDC, con el formato REQ-INF-año-secuencial (por ejemplo, REQ-INF-2026-0242). Esta referencia no se digita y no se repite.</w:t>
       </w:r>
     </w:p>
     <w:tbl>
@@ -3809,7 +3809,7 @@
                 <w:sz w:val="22"/>
                 <w:szCs w:val="22"/>
               </w:rPr>
-              <w:t xml:space="preserve">Auto-asignación:  </w:t>
+              <w:t xml:space="preserve">Asignación automática:  </w:t>
             </w:r>
             <w:r>
               <w:rPr>
@@ -3818,7 +3818,7 @@
                 <w:sz w:val="22"/>
                 <w:szCs w:val="22"/>
               </w:rPr>
-              <w:t xml:space="preserve">los oficios que usted registra quedan asignados a usted. Para asignarlos a otra persona hace falta un administrador.</w:t>
+              <w:t xml:space="preserve">los oficios registrados por un usuario quedan a su cargo. Su asignación a otra persona corresponde a un administrador.</w:t>
             </w:r>
           </w:p>
         </w:tc>
@@ -3855,7 +3855,7 @@
           <w:sz w:val="22"/>
           <w:szCs w:val="22"/>
         </w:rPr>
-        <w:t xml:space="preserve">En la pestaña Oficios, el panel Buscar oficios permite filtrar de dos formas, que pueden combinarse:</w:t>
+        <w:t xml:space="preserve">En la pestaña Oficios, el panel Buscar oficios permite filtrar por dos criterios, que pueden combinarse:</w:t>
       </w:r>
     </w:p>
     <w:p>
@@ -3886,7 +3886,7 @@
           <w:sz w:val="22"/>
           <w:szCs w:val="22"/>
         </w:rPr>
-        <w:t xml:space="preserve">Elija el campo (Referencia UDC, Referencia oficio, Causal oficio o Referencia SB), escriba lo que busca y pulse Buscar. No hace falta escribir el valor completo ni respetar mayúsculas.</w:t>
+        <w:t xml:space="preserve">Seleccione el campo (Referencia UDC, Referencia oficio, Causal oficio o Referencia SB), indique el texto y pulse Buscar. No es necesario escribir el valor completo ni respetar mayúsculas.</w:t>
       </w:r>
     </w:p>
     <w:p>
@@ -3917,7 +3917,7 @@
           <w:sz w:val="22"/>
           <w:szCs w:val="22"/>
         </w:rPr>
-        <w:t xml:space="preserve">Elija el tipo de fecha (de oficio, de recepción o de respuesta) y el rango desde–hasta. Ambos extremos se aplican siempre al mismo tipo de fecha. Si deja hasta vacío, busca por una fecha única.</w:t>
+        <w:t xml:space="preserve">Seleccione el tipo de fecha (de oficio, de recepción o de respuesta) y el rango desde–hasta. Ambos extremos corresponden siempre al mismo tipo de fecha. Si deja el campo hasta en blanco, la búsqueda se realiza por una fecha única.</w:t>
       </w:r>
     </w:p>
     <w:p>
@@ -3931,7 +3931,7 @@
           <w:sz w:val="22"/>
           <w:szCs w:val="22"/>
         </w:rPr>
-        <w:t xml:space="preserve">El botón Limpiar filtros devuelve la lista completa.</w:t>
+        <w:t xml:space="preserve">El botón Limpiar filtros restablece la lista completa.</w:t>
       </w:r>
     </w:p>
     <w:p>
@@ -3965,7 +3965,7 @@
           <w:sz w:val="22"/>
           <w:szCs w:val="22"/>
         </w:rPr>
-        <w:t xml:space="preserve">Seleccione el oficio en la lista y use el panel Modificar oficio seleccionado. Un usuario puede cambiar:</w:t>
+        <w:t xml:space="preserve">Seleccione el oficio en la lista y utilice el panel Modificar oficio seleccionado. El usuario puede actualizar:</w:t>
       </w:r>
     </w:p>
     <w:p>
@@ -4003,7 +4003,7 @@
           <w:sz w:val="22"/>
           <w:szCs w:val="22"/>
         </w:rPr>
-        <w:t xml:space="preserve">El estado, alternando entre En proceso y Finalizado</w:t>
+        <w:t xml:space="preserve">El estado, entre En proceso y Finalizado</w:t>
       </w:r>
     </w:p>
     <w:p>
@@ -4036,7 +4036,7 @@
           <w:sz w:val="22"/>
           <w:szCs w:val="22"/>
         </w:rPr>
-        <w:t xml:space="preserve">Pulse Guardar cambios para aplicarlos.</w:t>
+        <w:t xml:space="preserve">Pulse Guardar cambios para aplicar la modificación.</w:t>
       </w:r>
     </w:p>
     <w:tbl>
@@ -4091,7 +4091,7 @@
                 <w:sz w:val="22"/>
                 <w:szCs w:val="22"/>
               </w:rPr>
-              <w:t xml:space="preserve">si indica una fecha de respuesta, el oficio pasa automáticamente a Finalizado. Para reabrirlo, borre primero esa fecha con el botón Limpiar del calendario.</w:t>
+              <w:t xml:space="preserve">al registrar una fecha de respuesta, el oficio pasa automáticamente a Finalizado. Para reabrirlo, elimine previamente esa fecha con el botón Limpiar del calendario.</w:t>
             </w:r>
           </w:p>
         </w:tc>
@@ -4128,7 +4128,7 @@
           <w:sz w:val="22"/>
           <w:szCs w:val="22"/>
         </w:rPr>
-        <w:t xml:space="preserve">Cada oficio puede llevar adjunto el PDF de su respuesta:</w:t>
+        <w:t xml:space="preserve">Cada oficio admite el documento de respuesta en formato PDF:</w:t>
       </w:r>
     </w:p>
     <w:p>
@@ -4147,7 +4147,7 @@
           <w:sz w:val="22"/>
           <w:szCs w:val="22"/>
         </w:rPr>
-        <w:t xml:space="preserve">Adjuntar respuesta (PDF): selecciona el archivo y lo guarda junto al oficio.</w:t>
+        <w:t xml:space="preserve">Adjuntar respuesta (PDF): selecciona el archivo y lo asocia al oficio.</w:t>
       </w:r>
     </w:p>
     <w:p>
@@ -4166,7 +4166,7 @@
           <w:sz w:val="22"/>
           <w:szCs w:val="22"/>
         </w:rPr>
-        <w:t xml:space="preserve">Ver respuesta (PDF): lo muestra dentro de la aplicación, con avance de páginas y zoom.</w:t>
+        <w:t xml:space="preserve">Ver respuesta (PDF): permite consultarlo desde la propia aplicación.</w:t>
       </w:r>
     </w:p>
     <w:p>
@@ -4185,7 +4185,7 @@
           <w:sz w:val="22"/>
           <w:szCs w:val="22"/>
         </w:rPr>
-        <w:t xml:space="preserve">Eliminar PDF: lo borra, por si adjuntó el archivo equivocado.</w:t>
+        <w:t xml:space="preserve">Eliminar PDF: retira el documento adjunto.</w:t>
       </w:r>
     </w:p>
     <w:p>
@@ -4199,7 +4199,7 @@
           <w:sz w:val="22"/>
           <w:szCs w:val="22"/>
         </w:rPr>
-        <w:t xml:space="preserve">La columna PDF de la lista indica con «Sí» qué oficios ya tienen su respuesta adjunta.</w:t>
+        <w:t xml:space="preserve">La columna PDF de la lista señala con «Sí» los oficios que ya cuentan con su respuesta adjunta.</w:t>
       </w:r>
     </w:p>
     <w:p>
@@ -4233,7 +4233,7 @@
           <w:sz w:val="22"/>
           <w:szCs w:val="22"/>
         </w:rPr>
-        <w:t xml:space="preserve">Muestra indicadores y gráficos: total de oficios, cuántos hay en cada estado, porcentaje de finalizados, días promedio de respuesta y los recibidos por día y por mes. Para un usuario, el tablero refleja únicamente sus propios oficios.</w:t>
+        <w:t xml:space="preserve">Presenta los indicadores de gestión del área: total de oficios, distribución por estado, porcentaje de finalizados, días promedio de respuesta y oficios recibidos por día y por mes. Para el rol Usuario, el tablero considera únicamente sus propios oficios.</w:t>
       </w:r>
     </w:p>
     <w:p>
@@ -4272,7 +4272,7 @@
           <w:sz w:val="22"/>
           <w:szCs w:val="22"/>
         </w:rPr>
-        <w:t xml:space="preserve">El administrador hace todo lo del rol Usuario y, además, gestiona los oficios de todo el equipo y las cuentas de los usuarios.</w:t>
+        <w:t xml:space="preserve">El administrador dispone de las funciones del rol Usuario y, adicionalmente, gestiona los oficios de toda el área y las cuentas de acceso.</w:t>
       </w:r>
     </w:p>
     <w:p>
@@ -4306,7 +4306,7 @@
           <w:sz w:val="22"/>
           <w:szCs w:val="22"/>
         </w:rPr>
-        <w:t xml:space="preserve">A diferencia del usuario, el administrador ve en la pestaña Oficios los oficios de todas las personas, y en el panel de modificación puede cambiar:</w:t>
+        <w:t xml:space="preserve">A diferencia del usuario, el administrador visualiza en la pestaña Oficios los registros de todas las personas y, en el panel de modificación, puede actualizar:</w:t>
       </w:r>
     </w:p>
     <w:p>
@@ -4396,7 +4396,7 @@
           <w:sz w:val="22"/>
           <w:szCs w:val="22"/>
         </w:rPr>
-        <w:t xml:space="preserve">Al registrar un oficio también puede elegir a cualquier responsable, o dejarlo sin asignar.</w:t>
+        <w:t xml:space="preserve">Al registrar un oficio también puede designar a cualquier responsable o dejarlo sin asignar.</w:t>
       </w:r>
     </w:p>
     <w:p>
@@ -4454,7 +4454,7 @@
           <w:sz w:val="22"/>
           <w:szCs w:val="22"/>
         </w:rPr>
-        <w:t xml:space="preserve">Complete usuario, nombre y contraseña (dos veces).</w:t>
+        <w:t xml:space="preserve">Complete el usuario, el nombre y la contraseña (por duplicado).</w:t>
       </w:r>
     </w:p>
     <w:p>
@@ -4528,7 +4528,7 @@
                 <w:sz w:val="22"/>
                 <w:szCs w:val="22"/>
               </w:rPr>
-              <w:t xml:space="preserve">solo puede crear cuentas con rol «usuario». Crear administradores o superusuarios corresponde al superusuario.</w:t>
+              <w:t xml:space="preserve">únicamente puede crear cuentas con rol «usuario». La creación de administradores y superusuarios corresponde al superusuario.</w:t>
             </w:r>
           </w:p>
         </w:tc>
@@ -4565,7 +4565,7 @@
           <w:sz w:val="22"/>
           <w:szCs w:val="22"/>
         </w:rPr>
-        <w:t xml:space="preserve">Seleccione la persona en la lista y use los botones correspondientes:</w:t>
+        <w:t xml:space="preserve">Seleccione la persona en la lista y utilice el botón correspondiente:</w:t>
       </w:r>
     </w:p>
     <w:p>
@@ -4584,7 +4584,7 @@
           <w:sz w:val="22"/>
           <w:szCs w:val="22"/>
         </w:rPr>
-        <w:t xml:space="preserve">Editar seleccionado: cambia su nombre o su contraseña.</w:t>
+        <w:t xml:space="preserve">Editar seleccionado: modifica su nombre o su contraseña.</w:t>
       </w:r>
     </w:p>
     <w:p>
@@ -4603,7 +4603,7 @@
           <w:sz w:val="22"/>
           <w:szCs w:val="22"/>
         </w:rPr>
-        <w:t xml:space="preserve">Restablecer contraseña: para cuando alguien olvidó la suya. Se abre una ventana donde se escribe la nueva clave.</w:t>
+        <w:t xml:space="preserve">Restablecer contraseña: se utiliza cuando el usuario ha olvidado la suya; se abre una ventana para registrar la nueva clave.</w:t>
       </w:r>
     </w:p>
     <w:p>
@@ -4622,7 +4622,7 @@
           <w:sz w:val="22"/>
           <w:szCs w:val="22"/>
         </w:rPr>
-        <w:t xml:space="preserve">Eliminar seleccionado: borra la cuenta, previa confirmación.</w:t>
+        <w:t xml:space="preserve">Eliminar seleccionado: da de baja la cuenta, previa confirmación.</w:t>
       </w:r>
     </w:p>
     <w:p>
@@ -4641,7 +4641,7 @@
           <w:sz w:val="22"/>
           <w:szCs w:val="22"/>
         </w:rPr>
-        <w:t xml:space="preserve">Nuevo: limpia el formulario para crear otra cuenta.</w:t>
+        <w:t xml:space="preserve">Nuevo: limpia el formulario para registrar otra cuenta.</w:t>
       </w:r>
     </w:p>
     <w:p>
@@ -4661,7 +4661,7 @@
           <w:sz w:val="22"/>
           <w:szCs w:val="22"/>
         </w:rPr>
-        <w:t xml:space="preserve">Un administrador solo alcanza a las cuentas con rol «usuario» y a la suya propia. No puede editar, eliminar ni restablecer la contraseña de otro administrador ni de un superusuario.</w:t>
+        <w:t xml:space="preserve">El administrador solo alcanza a las cuentas con rol «usuario» y a la suya propia. No puede editar, eliminar ni restablecer la contraseña de otro administrador ni de un superusuario.</w:t>
       </w:r>
     </w:p>
     <w:p>
@@ -5175,7 +5175,7 @@
           <w:sz w:val="22"/>
           <w:szCs w:val="22"/>
         </w:rPr>
-        <w:t xml:space="preserve">En la pestaña Configuración se indica, una sola vez, la última Referencia UDC que se registró en el Excel anterior. El sistema continúa a partir de la siguiente.</w:t>
+        <w:t xml:space="preserve">En la pestaña Configuración se registra, por única vez, la última Referencia UDC utilizada en la matriz anterior. La aplicación continúa la numeración a partir de la siguiente.</w:t>
       </w:r>
     </w:p>
     <w:p>
@@ -5194,7 +5194,7 @@
           <w:sz w:val="22"/>
           <w:szCs w:val="22"/>
         </w:rPr>
-        <w:t xml:space="preserve">Escriba la referencia, por ejemplo REQ-INF-2026-0241.</w:t>
+        <w:t xml:space="preserve">Indique la referencia, por ejemplo REQ-INF-2026-0241.</w:t>
       </w:r>
     </w:p>
     <w:p>
@@ -5227,7 +5227,7 @@
           <w:sz w:val="22"/>
           <w:szCs w:val="22"/>
         </w:rPr>
-        <w:t xml:space="preserve">La pantalla muestra en todo momento cuál será la próxima Referencia UDC. La numeración se reinicia en 0001 cada año, y volver a configurarla nunca genera referencias repetidas.</w:t>
+        <w:t xml:space="preserve">La pantalla muestra en todo momento cuál será la próxima Referencia UDC. La numeración se reinicia en 0001 cada año y su reconfiguración no genera referencias duplicadas.</w:t>
       </w:r>
     </w:p>
     <w:p>
@@ -5241,7 +5241,7 @@
           <w:sz w:val="22"/>
           <w:szCs w:val="22"/>
         </w:rPr>
-        <w:t xml:space="preserve">Esa misma pestaña indica qué carpeta de datos está usando la aplicación, un dato útil cuando se trabaja sobre una carpeta compartida.</w:t>
+        <w:t xml:space="preserve">Esta misma pestaña indica la carpeta en la que la aplicación guarda la información, dato de utilidad cuando se trabaja sobre una carpeta compartida.</w:t>
       </w:r>
     </w:p>
     <w:p>
@@ -5280,7 +5280,7 @@
           <w:sz w:val="22"/>
           <w:szCs w:val="22"/>
         </w:rPr>
-        <w:t xml:space="preserve">El superusuario hace todo lo anterior y es el único que puede crear administradores y gestionar las copias de seguridad. Es el primer usuario que se creó al instalar la aplicación.</w:t>
+        <w:t xml:space="preserve">El superusuario dispone de todas las funciones anteriores y es el único autorizado para crear administradores y gestionar las copias de seguridad. Corresponde a la primera cuenta creada en la aplicación.</w:t>
       </w:r>
     </w:p>
     <w:p>
@@ -5314,7 +5314,7 @@
           <w:sz w:val="22"/>
           <w:szCs w:val="22"/>
         </w:rPr>
-        <w:t xml:space="preserve">En la pestaña Usuarios, el desplegable de rol le ofrece los tres roles. Puede crear cuentas de superusuario, de administrador o de usuario.</w:t>
+        <w:t xml:space="preserve">En la pestaña Usuarios, el desplegable de rol ofrece los tres roles disponibles, de modo que puede crear cuentas de superusuario, de administrador o de usuario.</w:t>
       </w:r>
     </w:p>
     <w:tbl>
@@ -5369,7 +5369,7 @@
                 <w:sz w:val="22"/>
                 <w:szCs w:val="22"/>
               </w:rPr>
-              <w:t xml:space="preserve">esa persona tendrá el mismo control que usted, incluida la posibilidad de gestionar su cuenta.</w:t>
+              <w:t xml:space="preserve">la nueva cuenta tendrá su mismo alcance, incluida la facultad de gestionar la cuenta de usted.</w:t>
             </w:r>
           </w:p>
         </w:tc>
@@ -5406,7 +5406,7 @@
           <w:sz w:val="22"/>
           <w:szCs w:val="22"/>
         </w:rPr>
-        <w:t xml:space="preserve">El superusuario puede editar, eliminar y restablecer la contraseña de cualquier persona, incluidos otros administradores y superusuarios.</w:t>
+        <w:t xml:space="preserve">El superusuario puede editar, eliminar y restablecer la contraseña de cualquier cuenta, incluidas las de otros administradores y superusuarios.</w:t>
       </w:r>
     </w:p>
     <w:p>
@@ -5420,7 +5420,7 @@
           <w:sz w:val="22"/>
           <w:szCs w:val="22"/>
         </w:rPr>
-        <w:t xml:space="preserve">Esto resuelve el caso de un administrador que olvida su contraseña, y también el de un superusuario: otro superusuario puede restablecérsela.</w:t>
+        <w:t xml:space="preserve">De esta forma se resuelve el olvido de contraseña de un administrador y también el de un superusuario, cuya clave puede ser restablecida por otro superusuario.</w:t>
       </w:r>
     </w:p>
     <w:tbl>
@@ -5475,7 +5475,7 @@
                 <w:sz w:val="22"/>
                 <w:szCs w:val="22"/>
               </w:rPr>
-              <w:t xml:space="preserve">el sistema nunca se queda sin superusuarios. El último que quede no puede eliminarse ni cambiar de rol; para poder hacerlo, cree antes otro superusuario.</w:t>
+              <w:t xml:space="preserve">el sistema no permite quedarse sin superusuarios. El último no puede eliminarse ni cambiar de rol; para ello debe crearse previamente otro superusuario.</w:t>
             </w:r>
           </w:p>
         </w:tc>
@@ -5512,7 +5512,7 @@
           <w:sz w:val="22"/>
           <w:szCs w:val="22"/>
         </w:rPr>
-        <w:t xml:space="preserve">La aplicación crea sola una copia al día, la primera vez que alguien la abre. Se guardan comprimidas dentro de la carpeta de datos, en la subcarpeta respaldos, y se conservan los últimos 30 días.</w:t>
+        <w:t xml:space="preserve">La aplicación genera una copia diaria de forma automática, la primera vez que se abre en el día. Las copias se almacenan comprimidas en la subcarpeta respaldos y se conservan durante los últimos 30 días.</w:t>
       </w:r>
     </w:p>
     <w:p>
@@ -5526,7 +5526,7 @@
           <w:sz w:val="22"/>
           <w:szCs w:val="22"/>
         </w:rPr>
-        <w:t xml:space="preserve">En la pestaña Configuración, el superusuario ve un panel exclusivo con la última copia realizada, cuántas hay guardadas y dos botones:</w:t>
+        <w:t xml:space="preserve">En la pestaña Configuración, el superusuario dispone de un panel exclusivo que indica la última copia realizada y el número de copias almacenadas, con dos opciones:</w:t>
       </w:r>
     </w:p>
     <w:p>
@@ -5564,7 +5564,7 @@
           <w:sz w:val="22"/>
           <w:szCs w:val="22"/>
         </w:rPr>
-        <w:t xml:space="preserve">Abrir carpeta de copias: abre la carpeta donde se guardan.</w:t>
+        <w:t xml:space="preserve">Abrir carpeta de copias: accede a la ubicación donde se almacenan.</w:t>
       </w:r>
     </w:p>
     <w:p>
@@ -5578,7 +5578,7 @@
           <w:sz w:val="22"/>
           <w:szCs w:val="22"/>
         </w:rPr>
-        <w:t xml:space="preserve">Las copias incluyen los oficios, las cuentas, la numeración, la clave de cifrado y la bitácora. No incluyen los PDF de respuesta.</w:t>
+        <w:t xml:space="preserve">Las copias comprenden los oficios, las cuentas, la numeración y la bitácora. No incluyen los documentos de respuesta en PDF.</w:t>
       </w:r>
     </w:p>
     <w:tbl>
@@ -5624,7 +5624,7 @@
                 <w:sz w:val="22"/>
                 <w:szCs w:val="22"/>
               </w:rPr>
-              <w:t xml:space="preserve">Cuidado con las copias:  </w:t>
+              <w:t xml:space="preserve">Custodia de las copias:  </w:t>
             </w:r>
             <w:r>
               <w:rPr>
@@ -5633,7 +5633,7 @@
                 <w:sz w:val="22"/>
                 <w:szCs w:val="22"/>
               </w:rPr>
-              <w:t xml:space="preserve">incluyen la clave de cifrado, así que quien tenga una puede leer toda la información. Guárdelas con el mismo cuidado que la carpeta de datos.</w:t>
+              <w:t xml:space="preserve">contienen toda la información del sistema, por lo que deben conservarse con la misma reserva que la carpeta de datos.</w:t>
             </w:r>
           </w:p>
         </w:tc>
@@ -5675,7 +5675,7 @@
           <w:sz w:val="22"/>
           <w:szCs w:val="22"/>
         </w:rPr>
-        <w:t xml:space="preserve">Estas reglas se aplican siempre, sea cual sea el rol de quien las intente saltar.</w:t>
+        <w:t xml:space="preserve">Las siguientes reglas se aplican en todos los casos, con independencia del rol.</w:t>
       </w:r>
     </w:p>
     <w:p>
@@ -5714,7 +5714,7 @@
           <w:sz w:val="22"/>
           <w:szCs w:val="22"/>
         </w:rPr>
-        <w:t xml:space="preserve">Ninguna fecha puede ser posterior a hoy: el calendario no deja elegir días futuros.</w:t>
+        <w:t xml:space="preserve">Ninguna fecha puede ser posterior al día actual; el calendario no admite fechas futuras.</w:t>
       </w:r>
     </w:p>
     <w:p>
@@ -5733,7 +5733,7 @@
           <w:sz w:val="22"/>
           <w:szCs w:val="22"/>
         </w:rPr>
-        <w:t xml:space="preserve">La fecha de oficio no puede ser posterior a la de recepción: un oficio no se recibe antes de existir.</w:t>
+        <w:t xml:space="preserve">La fecha de oficio no puede ser posterior a la de recepción.</w:t>
       </w:r>
     </w:p>
     <w:p>
@@ -5752,7 +5752,7 @@
           <w:sz w:val="22"/>
           <w:szCs w:val="22"/>
         </w:rPr>
-        <w:t xml:space="preserve">La fecha de respuesta no puede ser anterior a la de recepción: no se responde antes de recibir.</w:t>
+        <w:t xml:space="preserve">La fecha de respuesta no puede ser anterior a la de recepción.</w:t>
       </w:r>
     </w:p>
     <w:p>
@@ -5771,7 +5771,7 @@
           <w:sz w:val="22"/>
           <w:szCs w:val="22"/>
         </w:rPr>
-        <w:t xml:space="preserve">Si hay fecha de respuesta, el oficio queda Finalizado.</w:t>
+        <w:t xml:space="preserve">El registro de una fecha de respuesta finaliza el oficio.</w:t>
       </w:r>
     </w:p>
     <w:p>
@@ -5902,7 +5902,7 @@
                 <w:sz w:val="20"/>
                 <w:szCs w:val="20"/>
               </w:rPr>
-              <w:t xml:space="preserve">Sin responsable</w:t>
+              <w:t xml:space="preserve">Oficio sin responsable</w:t>
             </w:r>
           </w:p>
         </w:tc>
@@ -5964,7 +5964,7 @@
                 <w:sz w:val="20"/>
                 <w:szCs w:val="20"/>
               </w:rPr>
-              <w:t xml:space="preserve">Se asigna un responsable</w:t>
+              <w:t xml:space="preserve">Se designa un responsable</w:t>
             </w:r>
           </w:p>
         </w:tc>
@@ -6026,7 +6026,7 @@
                 <w:sz w:val="20"/>
                 <w:szCs w:val="20"/>
               </w:rPr>
-              <w:t xml:space="preserve">Se indica fecha de respuesta</w:t>
+              <w:t xml:space="preserve">Se registra la fecha de respuesta</w:t>
             </w:r>
           </w:p>
         </w:tc>
@@ -6078,7 +6078,7 @@
           <w:sz w:val="22"/>
           <w:szCs w:val="22"/>
         </w:rPr>
-        <w:t xml:space="preserve">Los estados En proceso y Finalizado exigen que el oficio tenga responsable.</w:t>
+        <w:t xml:space="preserve">Los estados En proceso y Finalizado requieren que el oficio tenga responsable asignado.</w:t>
       </w:r>
     </w:p>
     <w:p>
@@ -6094,7 +6094,7 @@
           <w:sz w:val="20"/>
           <w:szCs w:val="20"/>
         </w:rPr>
-        <w:t xml:space="preserve">En la pestaña Oficios cada estado se muestra con este mismo color, para reconocerlo de un vistazo.</w:t>
+        <w:t xml:space="preserve">En la pestaña Oficios cada estado se identifica con este mismo color.</w:t>
       </w:r>
     </w:p>
     <w:p>
@@ -6133,7 +6133,7 @@
           <w:sz w:val="22"/>
           <w:szCs w:val="22"/>
         </w:rPr>
-        <w:t xml:space="preserve">La Referencia UDC la genera el sistema y nunca se repite.</w:t>
+        <w:t xml:space="preserve">La Referencia UDC la genera la aplicación y no se repite.</w:t>
       </w:r>
     </w:p>
     <w:p>
@@ -6152,7 +6152,7 @@
           <w:sz w:val="22"/>
           <w:szCs w:val="22"/>
         </w:rPr>
-        <w:t xml:space="preserve">La Referencia oficio la escribe quien registra y tampoco puede repetirse.</w:t>
+        <w:t xml:space="preserve">La Referencia oficio la registra el usuario y tampoco admite duplicados.</w:t>
       </w:r>
     </w:p>
     <w:p>
@@ -6186,7 +6186,7 @@
           <w:sz w:val="22"/>
           <w:szCs w:val="22"/>
         </w:rPr>
-        <w:t xml:space="preserve">Toda acción que modifica información queda registrada con la fecha, la hora y la persona que la realizó: alta de oficios, cambios de estado o de responsable, adjuntos, altas y bajas de cuentas, cambios de contraseña e ingresos al sistema (incluidos los fallidos).</w:t>
+        <w:t xml:space="preserve">Toda operación que modifica información queda registrada con su fecha, su hora y la persona que la realizó: alta de oficios, cambios de estado o de responsable, documentos adjuntos, altas y bajas de cuentas, cambios de contraseña e ingresos al sistema, incluidos los intentos fallidos.</w:t>
       </w:r>
     </w:p>
     <w:p>
@@ -6228,7 +6228,7 @@
           <w:sz w:val="23"/>
           <w:szCs w:val="23"/>
         </w:rPr>
-        <w:t xml:space="preserve">No veo los oficios de mis compañeros</w:t>
+        <w:t xml:space="preserve">No visualizo los oficios de mis compañeros</w:t>
       </w:r>
     </w:p>
     <w:p>
@@ -6242,7 +6242,7 @@
           <w:sz w:val="22"/>
           <w:szCs w:val="22"/>
         </w:rPr>
-        <w:t xml:space="preserve">Es lo normal si su rol es Usuario: solo ve los oficios que registró o que tiene asignados. Los administradores y el superusuario ven todos.</w:t>
+        <w:t xml:space="preserve">Corresponde al rol Usuario, que accede únicamente a los oficios que ha registrado o que tiene asignados. Los administradores y el superusuario visualizan la totalidad.</w:t>
       </w:r>
     </w:p>
     <w:p>
@@ -6259,7 +6259,7 @@
           <w:sz w:val="23"/>
           <w:szCs w:val="23"/>
         </w:rPr>
-        <w:t xml:space="preserve">Olvidé mi contraseña</w:t>
+        <w:t xml:space="preserve">He olvidado mi contraseña</w:t>
       </w:r>
     </w:p>
     <w:p>
@@ -6273,7 +6273,7 @@
           <w:sz w:val="22"/>
           <w:szCs w:val="22"/>
         </w:rPr>
-        <w:t xml:space="preserve">Pida a un administrador o al superusuario que use la opción Restablecer contraseña. Usted escribirá la nueva clave en el momento.</w:t>
+        <w:t xml:space="preserve">Solicite a un administrador o al superusuario que utilice la opción Restablecer contraseña. La nueva clave se registra en ese momento.</w:t>
       </w:r>
     </w:p>
     <w:p>
@@ -6290,7 +6290,7 @@
           <w:sz w:val="23"/>
           <w:szCs w:val="23"/>
         </w:rPr>
-        <w:t xml:space="preserve">No puedo poner una fecha de mañana</w:t>
+        <w:t xml:space="preserve">No puedo registrar una fecha futura</w:t>
       </w:r>
     </w:p>
     <w:p>
@@ -6304,7 +6304,7 @@
           <w:sz w:val="22"/>
           <w:szCs w:val="22"/>
         </w:rPr>
-        <w:t xml:space="preserve">Es correcto: no se pueden registrar fechas futuras. El calendario muestra esos días en gris.</w:t>
+        <w:t xml:space="preserve">Es el comportamiento previsto: no se admiten fechas posteriores al día actual. El calendario presenta esos días en gris.</w:t>
       </w:r>
     </w:p>
     <w:p>
@@ -6321,7 +6321,7 @@
           <w:sz w:val="23"/>
           <w:szCs w:val="23"/>
         </w:rPr>
-        <w:t xml:space="preserve">Marqué Finalizado por error y no puedo volver a En proceso</w:t>
+        <w:t xml:space="preserve">He finalizado un oficio por error</w:t>
       </w:r>
     </w:p>
     <w:p>
@@ -6335,7 +6335,7 @@
           <w:sz w:val="22"/>
           <w:szCs w:val="22"/>
         </w:rPr>
-        <w:t xml:space="preserve">Si el oficio tiene fecha de respuesta, el sistema lo mantiene en Finalizado. Borre esa fecha con el botón Limpiar del calendario y guarde de nuevo.</w:t>
+        <w:t xml:space="preserve">Si el oficio tiene fecha de respuesta, permanece en estado Finalizado. Elimine esa fecha con el botón Limpiar del calendario y guarde nuevamente.</w:t>
       </w:r>
     </w:p>
     <w:p>
@@ -6352,7 +6352,7 @@
           <w:sz w:val="23"/>
           <w:szCs w:val="23"/>
         </w:rPr>
-        <w:t xml:space="preserve">Aparece «Otro usuario está guardando cambios en este momento»</w:t>
+        <w:t xml:space="preserve">Aparece el mensaje «Otro usuario está guardando cambios en este momento»</w:t>
       </w:r>
     </w:p>
     <w:p>
@@ -6366,7 +6366,7 @@
           <w:sz w:val="22"/>
           <w:szCs w:val="22"/>
         </w:rPr>
-        <w:t xml:space="preserve">Dos personas guardaron a la vez. Espere unos segundos y vuelva a intentarlo; el aviso evita que un cambio pise al otro.</w:t>
+        <w:t xml:space="preserve">Dos personas han guardado de forma simultánea. Espere unos segundos y repita la operación; el mensaje evita que una modificación se sobreponga a la otra.</w:t>
       </w:r>
     </w:p>
     <w:p>
@@ -6383,7 +6383,7 @@
           <w:sz w:val="23"/>
           <w:szCs w:val="23"/>
         </w:rPr>
-        <w:t xml:space="preserve">Al pulsar Ver respuesta (PDF) me ofrece abrirlo con otro programa</w:t>
+        <w:t xml:space="preserve">Al pulsar Ver respuesta (PDF) se ofrece abrirlo con otro programa</w:t>
       </w:r>
     </w:p>
     <w:p>
@@ -6397,7 +6397,7 @@
           <w:sz w:val="22"/>
           <w:szCs w:val="22"/>
         </w:rPr>
-        <w:t xml:space="preserve">El visor integrado no está disponible en ese equipo. Puede abrir el PDF con el lector del sistema sin ningún problema.</w:t>
+        <w:t xml:space="preserve">El visor integrado no está disponible en ese equipo. El documento puede consultarse con el lector de PDF del sistema.</w:t>
       </w:r>
     </w:p>
     <w:p>
@@ -6414,7 +6414,7 @@
           <w:sz w:val="23"/>
           <w:szCs w:val="23"/>
         </w:rPr>
-        <w:t xml:space="preserve">No aparece el botón para crear administradores</w:t>
+        <w:t xml:space="preserve">No aparece la opción para crear administradores</w:t>
       </w:r>
     </w:p>
     <w:p>
@@ -6428,7 +6428,7 @@
           <w:sz w:val="22"/>
           <w:szCs w:val="22"/>
         </w:rPr>
-        <w:t xml:space="preserve">Crear administradores y superusuarios es exclusivo del superusuario. Si necesita una cuenta de administrador, solicítela.</w:t>
+        <w:t xml:space="preserve">Es una facultad exclusiva del superusuario. Si requiere una cuenta de administrador, solicítela.</w:t>
       </w:r>
     </w:p>
     <w:p>

</xml_diff>

<commit_message>
Identificar versión y fecha de elaboración en el manual
- El pie de página incluye ahora la versión del documento, su fecha de
  elaboración y la versión de la aplicación, con el número de página
  alineado al margen derecho.
- La portada distingue la versión de la aplicación de la del documento y
  añade la fecha de elaboración.
- La introducción indica a qué versión de la aplicación corresponde el
  manual.

Co-Authored-By: Claude Opus 5 <noreply@anthropic.com>
Claude-Session: https://claude.ai/code/session_01XEwTjjddaCrigujsJqRUu1
</commit_message>
<xml_diff>
--- a/Manual de usuario - Control de Oficios.docx
+++ b/Manual de usuario - Control de Oficios.docx
@@ -159,22 +159,54 @@
     </w:p>
     <w:p>
       <w:pPr>
-        <w:spacing w:after="1700"/>
-      </w:pPr>
-    </w:p>
-    <w:p>
-      <w:pPr>
-        <w:spacing w:after="80"/>
+        <w:spacing w:after="1500"/>
+      </w:pPr>
+    </w:p>
+    <w:p>
+      <w:pPr>
+        <w:spacing w:after="60"/>
         <w:jc w:val="center"/>
       </w:pPr>
       <w:r>
         <w:rPr>
           <w:rFonts w:ascii="Calibri" w:cs="Calibri" w:eastAsia="Calibri" w:hAnsi="Calibri"/>
-          <w:color w:val="232B3D"/>
-          <w:sz w:val="22"/>
-          <w:szCs w:val="22"/>
-        </w:rPr>
-        <w:t xml:space="preserve">Versión 1.0  ·  Agosto 2026</w:t>
+          <w:b/>
+          <w:bCs/>
+          <w:color w:val="232B3D"/>
+          <w:sz w:val="22"/>
+          <w:szCs w:val="22"/>
+        </w:rPr>
+        <w:t xml:space="preserve">Aplicación versión 1.0</w:t>
+      </w:r>
+    </w:p>
+    <w:p>
+      <w:pPr>
+        <w:spacing w:after="60"/>
+        <w:jc w:val="center"/>
+      </w:pPr>
+      <w:r>
+        <w:rPr>
+          <w:rFonts w:ascii="Calibri" w:cs="Calibri" w:eastAsia="Calibri" w:hAnsi="Calibri"/>
+          <w:color w:val="232B3D"/>
+          <w:sz w:val="22"/>
+          <w:szCs w:val="22"/>
+        </w:rPr>
+        <w:t xml:space="preserve">Documento versión 1.0</w:t>
+      </w:r>
+    </w:p>
+    <w:p>
+      <w:pPr>
+        <w:spacing w:after="120"/>
+        <w:jc w:val="center"/>
+      </w:pPr>
+      <w:r>
+        <w:rPr>
+          <w:rFonts w:ascii="Calibri" w:cs="Calibri" w:eastAsia="Calibri" w:hAnsi="Calibri"/>
+          <w:color w:val="5A6B8C"/>
+          <w:sz w:val="22"/>
+          <w:szCs w:val="22"/>
+        </w:rPr>
+        <w:t xml:space="preserve">Elaborado el 6 de agosto de 2026</w:t>
       </w:r>
     </w:p>
     <w:p>
@@ -1445,6 +1477,20 @@
           <w:szCs w:val="22"/>
         </w:rPr>
         <w:t xml:space="preserve">Constituye un complemento de la matriz de control que se venía utilizando: centraliza el registro, asigna la numeración de forma automática y permite consultar en cualquier momento la situación de cada requerimiento.</w:t>
+      </w:r>
+    </w:p>
+    <w:p>
+      <w:pPr>
+        <w:spacing w:after="120" w:line="276"/>
+      </w:pPr>
+      <w:r>
+        <w:rPr>
+          <w:rFonts w:ascii="Calibri" w:cs="Calibri" w:eastAsia="Calibri" w:hAnsi="Calibri"/>
+          <w:color w:val="232B3D"/>
+          <w:sz w:val="22"/>
+          <w:szCs w:val="22"/>
+        </w:rPr>
+        <w:t xml:space="preserve">El presente manual corresponde a la versión 1.0 de la aplicación.</w:t>
       </w:r>
     </w:p>
     <w:p>
@@ -6515,8 +6561,10 @@
       <w:pBdr>
         <w:top w:val="single" w:color="E1E5EC" w:sz="4" w:space="8"/>
       </w:pBdr>
+      <w:tabs>
+        <w:tab w:val="right" w:pos="9360"/>
+      </w:tabs>
       <w:spacing w:before="120"/>
-      <w:jc w:val="center"/>
     </w:pPr>
     <w:r>
       <w:rPr>
@@ -6525,7 +6573,15 @@
         <w:sz w:val="16"/>
         <w:szCs w:val="16"/>
       </w:rPr>
-      <w:t xml:space="preserve">Control de Oficios  ·  Unidad de Cumplimiento  ·  </w:t>
+      <w:t xml:space="preserve">Manual de usuario · Versión 1.0 · 6 de agosto de 2026  |  Aplicación versión 1.0</w:t>
+    </w:r>
+    <w:r>
+      <w:rPr>
+        <w:rFonts w:ascii="Calibri" w:cs="Calibri" w:eastAsia="Calibri" w:hAnsi="Calibri"/>
+        <w:sz w:val="16"/>
+        <w:szCs w:val="16"/>
+      </w:rPr>
+      <w:tab/>
     </w:r>
     <w:r>
       <w:rPr>

</xml_diff>

<commit_message>
Manual de usuario a la version 2.1 del documento
Se pone al dia con lo ultimo incorporado:

- Formato de la identificacion de los implicados: cedula de 10 digitos,
  RUC de 13 y pasaporte alfanumerico, con la aclaracion de que los
  puntos, guiones y espacios se pueden escribir y no se guardan.
- Tablero: la tabla de los cinco graficos, entre ellos el de personas
  investigadas por mes, y el apartado de filtros del tablero.
- Dos preguntas frecuentes nuevas: la identificacion rechazada y el
  tablero que no presenta todos los oficios.

Co-Authored-By: Claude Opus 5 <noreply@anthropic.com>
Claude-Session: https://claude.ai/code/session_01XEwTjjddaCrigujsJqRUu1
</commit_message>
<xml_diff>
--- a/Manual de usuario - Control de Oficios.docx
+++ b/Manual de usuario - Control de Oficios.docx
@@ -191,7 +191,7 @@
           <w:sz w:val="22"/>
           <w:szCs w:val="22"/>
         </w:rPr>
-        <w:t xml:space="preserve">Documento versión 2.0</w:t>
+        <w:t xml:space="preserve">Documento versión 2.1</w:t>
       </w:r>
     </w:p>
     <w:p>
@@ -206,7 +206,7 @@
           <w:sz w:val="22"/>
           <w:szCs w:val="22"/>
         </w:rPr>
-        <w:t xml:space="preserve">Actualizado el 13 de agosto de 2026</w:t>
+        <w:t xml:space="preserve">Actualizado el 18 de agosto de 2026</w:t>
       </w:r>
     </w:p>
     <w:p>
@@ -751,7 +751,7 @@
           <w:sz w:val="21"/>
           <w:szCs w:val="21"/>
         </w:rPr>
-        <w:t xml:space="preserve">6</w:t>
+        <w:t xml:space="preserve">7</w:t>
       </w:r>
     </w:p>
     <w:p>
@@ -835,7 +835,7 @@
           <w:sz w:val="21"/>
           <w:szCs w:val="21"/>
         </w:rPr>
-        <w:t xml:space="preserve">7</w:t>
+        <w:t xml:space="preserve">8</w:t>
       </w:r>
     </w:p>
     <w:p>
@@ -961,7 +961,7 @@
           <w:sz w:val="22"/>
           <w:szCs w:val="22"/>
         </w:rPr>
-        <w:t xml:space="preserve">9</w:t>
+        <w:t xml:space="preserve">10</w:t>
       </w:r>
     </w:p>
     <w:p>
@@ -1003,7 +1003,7 @@
           <w:sz w:val="21"/>
           <w:szCs w:val="21"/>
         </w:rPr>
-        <w:t xml:space="preserve">9</w:t>
+        <w:t xml:space="preserve">10</w:t>
       </w:r>
     </w:p>
     <w:p>
@@ -1045,7 +1045,7 @@
           <w:sz w:val="21"/>
           <w:szCs w:val="21"/>
         </w:rPr>
-        <w:t xml:space="preserve">9</w:t>
+        <w:t xml:space="preserve">10</w:t>
       </w:r>
     </w:p>
     <w:p>
@@ -1087,7 +1087,7 @@
           <w:sz w:val="21"/>
           <w:szCs w:val="21"/>
         </w:rPr>
-        <w:t xml:space="preserve">10</w:t>
+        <w:t xml:space="preserve">11</w:t>
       </w:r>
     </w:p>
     <w:p>
@@ -1129,7 +1129,7 @@
           <w:sz w:val="21"/>
           <w:szCs w:val="21"/>
         </w:rPr>
-        <w:t xml:space="preserve">10</w:t>
+        <w:t xml:space="preserve">11</w:t>
       </w:r>
     </w:p>
     <w:p>
@@ -1171,7 +1171,7 @@
           <w:sz w:val="21"/>
           <w:szCs w:val="21"/>
         </w:rPr>
-        <w:t xml:space="preserve">10</w:t>
+        <w:t xml:space="preserve">11</w:t>
       </w:r>
     </w:p>
     <w:p>
@@ -1213,7 +1213,7 @@
           <w:sz w:val="21"/>
           <w:szCs w:val="21"/>
         </w:rPr>
-        <w:t xml:space="preserve">11</w:t>
+        <w:t xml:space="preserve">12</w:t>
       </w:r>
     </w:p>
     <w:p>
@@ -1255,7 +1255,7 @@
           <w:sz w:val="21"/>
           <w:szCs w:val="21"/>
         </w:rPr>
-        <w:t xml:space="preserve">11</w:t>
+        <w:t xml:space="preserve">12</w:t>
       </w:r>
     </w:p>
     <w:p>
@@ -1297,7 +1297,7 @@
           <w:sz w:val="22"/>
           <w:szCs w:val="22"/>
         </w:rPr>
-        <w:t xml:space="preserve">13</w:t>
+        <w:t xml:space="preserve">14</w:t>
       </w:r>
     </w:p>
     <w:p>
@@ -1339,7 +1339,7 @@
           <w:sz w:val="21"/>
           <w:szCs w:val="21"/>
         </w:rPr>
-        <w:t xml:space="preserve">13</w:t>
+        <w:t xml:space="preserve">14</w:t>
       </w:r>
     </w:p>
     <w:p>
@@ -1381,7 +1381,7 @@
           <w:sz w:val="21"/>
           <w:szCs w:val="21"/>
         </w:rPr>
-        <w:t xml:space="preserve">13</w:t>
+        <w:t xml:space="preserve">14</w:t>
       </w:r>
     </w:p>
     <w:p>
@@ -1423,7 +1423,7 @@
           <w:sz w:val="21"/>
           <w:szCs w:val="21"/>
         </w:rPr>
-        <w:t xml:space="preserve">13</w:t>
+        <w:t xml:space="preserve">14</w:t>
       </w:r>
     </w:p>
     <w:p>
@@ -1465,7 +1465,7 @@
           <w:sz w:val="22"/>
           <w:szCs w:val="22"/>
         </w:rPr>
-        <w:t xml:space="preserve">14</w:t>
+        <w:t xml:space="preserve">15</w:t>
       </w:r>
     </w:p>
     <w:p>
@@ -1507,7 +1507,7 @@
           <w:sz w:val="21"/>
           <w:szCs w:val="21"/>
         </w:rPr>
-        <w:t xml:space="preserve">14</w:t>
+        <w:t xml:space="preserve">15</w:t>
       </w:r>
     </w:p>
     <w:p>
@@ -1549,7 +1549,7 @@
           <w:sz w:val="21"/>
           <w:szCs w:val="21"/>
         </w:rPr>
-        <w:t xml:space="preserve">14</w:t>
+        <w:t xml:space="preserve">15</w:t>
       </w:r>
     </w:p>
     <w:p>
@@ -1591,7 +1591,7 @@
           <w:sz w:val="21"/>
           <w:szCs w:val="21"/>
         </w:rPr>
-        <w:t xml:space="preserve">14</w:t>
+        <w:t xml:space="preserve">15</w:t>
       </w:r>
     </w:p>
     <w:p>
@@ -1633,7 +1633,7 @@
           <w:sz w:val="21"/>
           <w:szCs w:val="21"/>
         </w:rPr>
-        <w:t xml:space="preserve">14</w:t>
+        <w:t xml:space="preserve">15</w:t>
       </w:r>
     </w:p>
     <w:p>
@@ -1675,7 +1675,7 @@
           <w:sz w:val="21"/>
           <w:szCs w:val="21"/>
         </w:rPr>
-        <w:t xml:space="preserve">15</w:t>
+        <w:t xml:space="preserve">16</w:t>
       </w:r>
     </w:p>
     <w:p>
@@ -1717,7 +1717,7 @@
           <w:sz w:val="21"/>
           <w:szCs w:val="21"/>
         </w:rPr>
-        <w:t xml:space="preserve">15</w:t>
+        <w:t xml:space="preserve">16</w:t>
       </w:r>
     </w:p>
     <w:p>
@@ -1759,7 +1759,7 @@
           <w:sz w:val="22"/>
           <w:szCs w:val="22"/>
         </w:rPr>
-        <w:t xml:space="preserve">16</w:t>
+        <w:t xml:space="preserve">17</w:t>
       </w:r>
     </w:p>
     <w:p>
@@ -5236,7 +5236,7 @@
                 <w:sz w:val="20"/>
                 <w:szCs w:val="20"/>
               </w:rPr>
-              <w:t xml:space="preserve">Si se indica, debe señalarse su tipo</w:t>
+              <w:t xml:space="preserve">Si se indica, debe señalarse su tipo y cumplir su formato</w:t>
             </w:r>
           </w:p>
         </w:tc>
@@ -5511,6 +5511,332 @@
     </w:tbl>
     <w:p>
       <w:pPr>
+        <w:pStyle w:val="Heading3"/>
+        <w:spacing w:after="100" w:before="200"/>
+      </w:pPr>
+      <w:r>
+        <w:rPr>
+          <w:rFonts w:ascii="Calibri" w:cs="Calibri" w:eastAsia="Calibri" w:hAnsi="Calibri"/>
+          <w:b/>
+          <w:bCs/>
+          <w:color w:val="5A6B8C"/>
+          <w:sz w:val="23"/>
+          <w:szCs w:val="23"/>
+        </w:rPr>
+        <w:t xml:space="preserve">Formato de la identificación</w:t>
+      </w:r>
+    </w:p>
+    <w:p>
+      <w:pPr>
+        <w:spacing w:after="120" w:line="276"/>
+      </w:pPr>
+      <w:r>
+        <w:rPr>
+          <w:rFonts w:ascii="Calibri" w:cs="Calibri" w:eastAsia="Calibri" w:hAnsi="Calibri"/>
+          <w:color w:val="232B3D"/>
+          <w:sz w:val="22"/>
+          <w:szCs w:val="22"/>
+        </w:rPr>
+        <w:t xml:space="preserve">La identificación es opcional, ya que existen requerimientos sobre personas de las que la institución no aporta documento. No obstante, cuando se registra, debe corresponder al tipo señalado:</w:t>
+      </w:r>
+    </w:p>
+    <w:tbl>
+      <w:tblPr>
+        <w:tblW w:type="dxa" w:w="9360"/>
+        <w:tblBorders>
+          <w:top w:val="single" w:color="152342" w:sz="4"/>
+          <w:left w:val="single" w:color="CBD2DE" w:sz="2"/>
+          <w:bottom w:val="single" w:color="152342" w:sz="4"/>
+          <w:right w:val="single" w:color="CBD2DE" w:sz="2"/>
+          <w:insideH w:val="single" w:color="E1E5EC" w:sz="2"/>
+          <w:insideV w:val="single" w:color="E1E5EC" w:sz="2"/>
+        </w:tblBorders>
+      </w:tblPr>
+      <w:tblGrid>
+        <w:gridCol w:w="3100"/>
+        <w:gridCol w:w="6260"/>
+      </w:tblGrid>
+      <w:tr>
+        <w:trPr>
+          <w:cantSplit/>
+          <w:tblHeader/>
+        </w:trPr>
+        <w:tc>
+          <w:tcPr>
+            <w:tcW w:type="dxa" w:w="3100"/>
+            <w:shd w:fill="152342" w:val="clear"/>
+            <w:tcMar>
+              <w:top w:type="dxa" w:w="80"/>
+              <w:left w:type="dxa" w:w="120"/>
+              <w:bottom w:type="dxa" w:w="80"/>
+              <w:right w:type="dxa" w:w="120"/>
+            </w:tcMar>
+          </w:tcPr>
+          <w:p>
+            <w:pPr>
+              <w:keepNext/>
+              <w:spacing w:after="0" w:line="264"/>
+            </w:pPr>
+            <w:r>
+              <w:rPr>
+                <w:rFonts w:ascii="Calibri" w:cs="Calibri" w:eastAsia="Calibri" w:hAnsi="Calibri"/>
+                <w:b/>
+                <w:bCs/>
+                <w:color w:val="FFFFFF"/>
+                <w:sz w:val="20"/>
+                <w:szCs w:val="20"/>
+              </w:rPr>
+              <w:t xml:space="preserve">Tipo</w:t>
+            </w:r>
+          </w:p>
+        </w:tc>
+        <w:tc>
+          <w:tcPr>
+            <w:tcW w:type="dxa" w:w="6260"/>
+            <w:shd w:fill="152342" w:val="clear"/>
+            <w:tcMar>
+              <w:top w:type="dxa" w:w="80"/>
+              <w:left w:type="dxa" w:w="120"/>
+              <w:bottom w:type="dxa" w:w="80"/>
+              <w:right w:type="dxa" w:w="120"/>
+            </w:tcMar>
+          </w:tcPr>
+          <w:p>
+            <w:pPr>
+              <w:keepNext/>
+              <w:spacing w:after="0" w:line="264"/>
+              <w:jc w:val="center"/>
+            </w:pPr>
+            <w:r>
+              <w:rPr>
+                <w:rFonts w:ascii="Calibri" w:cs="Calibri" w:eastAsia="Calibri" w:hAnsi="Calibri"/>
+                <w:b/>
+                <w:bCs/>
+                <w:color w:val="FFFFFF"/>
+                <w:sz w:val="20"/>
+                <w:szCs w:val="20"/>
+              </w:rPr>
+              <w:t xml:space="preserve">Formato exigido</w:t>
+            </w:r>
+          </w:p>
+        </w:tc>
+      </w:tr>
+      <w:tr>
+        <w:trPr>
+          <w:cantSplit/>
+        </w:trPr>
+        <w:tc>
+          <w:tcPr>
+            <w:tcW w:type="dxa" w:w="3100"/>
+            <w:shd w:fill="FFFFFF" w:val="clear"/>
+            <w:tcMar>
+              <w:top w:type="dxa" w:w="80"/>
+              <w:left w:type="dxa" w:w="120"/>
+              <w:bottom w:type="dxa" w:w="80"/>
+              <w:right w:type="dxa" w:w="120"/>
+            </w:tcMar>
+          </w:tcPr>
+          <w:p>
+            <w:pPr>
+              <w:keepNext/>
+              <w:spacing w:after="0" w:line="264"/>
+            </w:pPr>
+            <w:r>
+              <w:rPr>
+                <w:rFonts w:ascii="Calibri" w:cs="Calibri" w:eastAsia="Calibri" w:hAnsi="Calibri"/>
+                <w:color w:val="232B3D"/>
+                <w:sz w:val="20"/>
+                <w:szCs w:val="20"/>
+              </w:rPr>
+              <w:t xml:space="preserve">Cédula</w:t>
+            </w:r>
+          </w:p>
+        </w:tc>
+        <w:tc>
+          <w:tcPr>
+            <w:tcW w:type="dxa" w:w="6260"/>
+            <w:shd w:fill="FFFFFF" w:val="clear"/>
+            <w:tcMar>
+              <w:top w:type="dxa" w:w="80"/>
+              <w:left w:type="dxa" w:w="120"/>
+              <w:bottom w:type="dxa" w:w="80"/>
+              <w:right w:type="dxa" w:w="120"/>
+            </w:tcMar>
+          </w:tcPr>
+          <w:p>
+            <w:pPr>
+              <w:keepNext/>
+              <w:spacing w:after="0" w:line="264"/>
+              <w:jc w:val="center"/>
+            </w:pPr>
+            <w:r>
+              <w:rPr>
+                <w:rFonts w:ascii="Calibri" w:cs="Calibri" w:eastAsia="Calibri" w:hAnsi="Calibri"/>
+                <w:color w:val="232B3D"/>
+                <w:sz w:val="20"/>
+                <w:szCs w:val="20"/>
+              </w:rPr>
+              <w:t xml:space="preserve">10 dígitos</w:t>
+            </w:r>
+          </w:p>
+        </w:tc>
+      </w:tr>
+      <w:tr>
+        <w:trPr>
+          <w:cantSplit/>
+        </w:trPr>
+        <w:tc>
+          <w:tcPr>
+            <w:tcW w:type="dxa" w:w="3100"/>
+            <w:shd w:fill="F7F8FA" w:val="clear"/>
+            <w:tcMar>
+              <w:top w:type="dxa" w:w="80"/>
+              <w:left w:type="dxa" w:w="120"/>
+              <w:bottom w:type="dxa" w:w="80"/>
+              <w:right w:type="dxa" w:w="120"/>
+            </w:tcMar>
+          </w:tcPr>
+          <w:p>
+            <w:pPr>
+              <w:keepNext/>
+              <w:spacing w:after="0" w:line="264"/>
+            </w:pPr>
+            <w:r>
+              <w:rPr>
+                <w:rFonts w:ascii="Calibri" w:cs="Calibri" w:eastAsia="Calibri" w:hAnsi="Calibri"/>
+                <w:color w:val="232B3D"/>
+                <w:sz w:val="20"/>
+                <w:szCs w:val="20"/>
+              </w:rPr>
+              <w:t xml:space="preserve">RUC</w:t>
+            </w:r>
+          </w:p>
+        </w:tc>
+        <w:tc>
+          <w:tcPr>
+            <w:tcW w:type="dxa" w:w="6260"/>
+            <w:shd w:fill="F7F8FA" w:val="clear"/>
+            <w:tcMar>
+              <w:top w:type="dxa" w:w="80"/>
+              <w:left w:type="dxa" w:w="120"/>
+              <w:bottom w:type="dxa" w:w="80"/>
+              <w:right w:type="dxa" w:w="120"/>
+            </w:tcMar>
+          </w:tcPr>
+          <w:p>
+            <w:pPr>
+              <w:keepNext/>
+              <w:spacing w:after="0" w:line="264"/>
+              <w:jc w:val="center"/>
+            </w:pPr>
+            <w:r>
+              <w:rPr>
+                <w:rFonts w:ascii="Calibri" w:cs="Calibri" w:eastAsia="Calibri" w:hAnsi="Calibri"/>
+                <w:color w:val="232B3D"/>
+                <w:sz w:val="20"/>
+                <w:szCs w:val="20"/>
+              </w:rPr>
+              <w:t xml:space="preserve">13 dígitos</w:t>
+            </w:r>
+          </w:p>
+        </w:tc>
+      </w:tr>
+      <w:tr>
+        <w:trPr>
+          <w:cantSplit/>
+        </w:trPr>
+        <w:tc>
+          <w:tcPr>
+            <w:tcW w:type="dxa" w:w="3100"/>
+            <w:shd w:fill="FFFFFF" w:val="clear"/>
+            <w:tcMar>
+              <w:top w:type="dxa" w:w="80"/>
+              <w:left w:type="dxa" w:w="120"/>
+              <w:bottom w:type="dxa" w:w="80"/>
+              <w:right w:type="dxa" w:w="120"/>
+            </w:tcMar>
+          </w:tcPr>
+          <w:p>
+            <w:pPr>
+              <w:keepNext w:val="false"/>
+              <w:spacing w:after="0" w:line="264"/>
+            </w:pPr>
+            <w:r>
+              <w:rPr>
+                <w:rFonts w:ascii="Calibri" w:cs="Calibri" w:eastAsia="Calibri" w:hAnsi="Calibri"/>
+                <w:color w:val="232B3D"/>
+                <w:sz w:val="20"/>
+                <w:szCs w:val="20"/>
+              </w:rPr>
+              <w:t xml:space="preserve">Pasaporte</w:t>
+            </w:r>
+          </w:p>
+        </w:tc>
+        <w:tc>
+          <w:tcPr>
+            <w:tcW w:type="dxa" w:w="6260"/>
+            <w:shd w:fill="FFFFFF" w:val="clear"/>
+            <w:tcMar>
+              <w:top w:type="dxa" w:w="80"/>
+              <w:left w:type="dxa" w:w="120"/>
+              <w:bottom w:type="dxa" w:w="80"/>
+              <w:right w:type="dxa" w:w="120"/>
+            </w:tcMar>
+          </w:tcPr>
+          <w:p>
+            <w:pPr>
+              <w:keepNext w:val="false"/>
+              <w:spacing w:after="0" w:line="264"/>
+              <w:jc w:val="center"/>
+            </w:pPr>
+            <w:r>
+              <w:rPr>
+                <w:rFonts w:ascii="Calibri" w:cs="Calibri" w:eastAsia="Calibri" w:hAnsi="Calibri"/>
+                <w:color w:val="232B3D"/>
+                <w:sz w:val="20"/>
+                <w:szCs w:val="20"/>
+              </w:rPr>
+              <w:t xml:space="preserve">Letras y números</w:t>
+            </w:r>
+          </w:p>
+        </w:tc>
+      </w:tr>
+    </w:tbl>
+    <w:p>
+      <w:pPr>
+        <w:spacing w:after="200"/>
+      </w:pPr>
+    </w:p>
+    <w:p>
+      <w:pPr>
+        <w:spacing w:after="120" w:line="276"/>
+      </w:pPr>
+      <w:r>
+        <w:rPr>
+          <w:rFonts w:ascii="Calibri" w:cs="Calibri" w:eastAsia="Calibri" w:hAnsi="Calibri"/>
+          <w:color w:val="232B3D"/>
+          <w:sz w:val="22"/>
+          <w:szCs w:val="22"/>
+        </w:rPr>
+        <w:t xml:space="preserve">Los puntos, guiones y espacios pueden escribirse libremente: la aplicación los retira antes de comprobar el documento y guarda únicamente sus dígitos o caracteres. De este modo, 1400.349-096 y 1400349096 se registran como el mismo documento.</w:t>
+      </w:r>
+    </w:p>
+    <w:p>
+      <w:pPr>
+        <w:spacing w:after="120" w:line="276"/>
+      </w:pPr>
+      <w:r>
+        <w:rPr>
+          <w:rFonts w:ascii="Calibri" w:cs="Calibri" w:eastAsia="Calibri" w:hAnsi="Calibri"/>
+          <w:color w:val="232B3D"/>
+          <w:sz w:val="22"/>
+          <w:szCs w:val="22"/>
+        </w:rPr>
+        <w:t xml:space="preserve">Si el documento no corresponde al tipo indicado, la aplicación lo señala al añadir a la persona.</w:t>
+      </w:r>
+    </w:p>
+    <w:p>
+      <w:pPr>
         <w:pStyle w:val="Heading2"/>
         <w:pBdr>
           <w:bottom w:val="single" w:color="E1E5EC" w:sz="4" w:space="5"/>
@@ -6207,7 +6533,510 @@
           <w:sz w:val="22"/>
           <w:szCs w:val="22"/>
         </w:rPr>
-        <w:t xml:space="preserve">Presenta los indicadores de gestión del área: total de oficios, distribución por estado, porcentaje de finalizados, días promedio de respuesta, oficios recibidos por día y por mes, y carga por responsable. Para el rol Usuario, el tablero considera únicamente sus propios oficios.</w:t>
+        <w:t xml:space="preserve">Presenta los indicadores de gestión del área. Las tarjetas superiores resumen el volumen y la situación de los oficios: total, distribución por estado, porcentaje de finalizados, días promedio de respuesta, recepciones del día, de la semana y del mes, y seguimiento de las respuestas. A continuación se presentan cinco gráficos:</w:t>
+      </w:r>
+    </w:p>
+    <w:tbl>
+      <w:tblPr>
+        <w:tblW w:type="dxa" w:w="9360"/>
+        <w:tblBorders>
+          <w:top w:val="single" w:color="152342" w:sz="4"/>
+          <w:left w:val="single" w:color="CBD2DE" w:sz="2"/>
+          <w:bottom w:val="single" w:color="152342" w:sz="4"/>
+          <w:right w:val="single" w:color="CBD2DE" w:sz="2"/>
+          <w:insideH w:val="single" w:color="E1E5EC" w:sz="2"/>
+          <w:insideV w:val="single" w:color="E1E5EC" w:sz="2"/>
+        </w:tblBorders>
+      </w:tblPr>
+      <w:tblGrid>
+        <w:gridCol w:w="3100"/>
+        <w:gridCol w:w="6260"/>
+      </w:tblGrid>
+      <w:tr>
+        <w:trPr>
+          <w:cantSplit/>
+          <w:tblHeader/>
+        </w:trPr>
+        <w:tc>
+          <w:tcPr>
+            <w:tcW w:type="dxa" w:w="3100"/>
+            <w:shd w:fill="152342" w:val="clear"/>
+            <w:tcMar>
+              <w:top w:type="dxa" w:w="80"/>
+              <w:left w:type="dxa" w:w="120"/>
+              <w:bottom w:type="dxa" w:w="80"/>
+              <w:right w:type="dxa" w:w="120"/>
+            </w:tcMar>
+          </w:tcPr>
+          <w:p>
+            <w:pPr>
+              <w:keepNext/>
+              <w:spacing w:after="0" w:line="264"/>
+            </w:pPr>
+            <w:r>
+              <w:rPr>
+                <w:rFonts w:ascii="Calibri" w:cs="Calibri" w:eastAsia="Calibri" w:hAnsi="Calibri"/>
+                <w:b/>
+                <w:bCs/>
+                <w:color w:val="FFFFFF"/>
+                <w:sz w:val="20"/>
+                <w:szCs w:val="20"/>
+              </w:rPr>
+              <w:t xml:space="preserve">Gráfico</w:t>
+            </w:r>
+          </w:p>
+        </w:tc>
+        <w:tc>
+          <w:tcPr>
+            <w:tcW w:type="dxa" w:w="6260"/>
+            <w:shd w:fill="152342" w:val="clear"/>
+            <w:tcMar>
+              <w:top w:type="dxa" w:w="80"/>
+              <w:left w:type="dxa" w:w="120"/>
+              <w:bottom w:type="dxa" w:w="80"/>
+              <w:right w:type="dxa" w:w="120"/>
+            </w:tcMar>
+          </w:tcPr>
+          <w:p>
+            <w:pPr>
+              <w:keepNext/>
+              <w:spacing w:after="0" w:line="264"/>
+              <w:jc w:val="center"/>
+            </w:pPr>
+            <w:r>
+              <w:rPr>
+                <w:rFonts w:ascii="Calibri" w:cs="Calibri" w:eastAsia="Calibri" w:hAnsi="Calibri"/>
+                <w:b/>
+                <w:bCs/>
+                <w:color w:val="FFFFFF"/>
+                <w:sz w:val="20"/>
+                <w:szCs w:val="20"/>
+              </w:rPr>
+              <w:t xml:space="preserve">Qué presenta</w:t>
+            </w:r>
+          </w:p>
+        </w:tc>
+      </w:tr>
+      <w:tr>
+        <w:trPr>
+          <w:cantSplit/>
+        </w:trPr>
+        <w:tc>
+          <w:tcPr>
+            <w:tcW w:type="dxa" w:w="3100"/>
+            <w:shd w:fill="FFFFFF" w:val="clear"/>
+            <w:tcMar>
+              <w:top w:type="dxa" w:w="80"/>
+              <w:left w:type="dxa" w:w="120"/>
+              <w:bottom w:type="dxa" w:w="80"/>
+              <w:right w:type="dxa" w:w="120"/>
+            </w:tcMar>
+          </w:tcPr>
+          <w:p>
+            <w:pPr>
+              <w:keepNext/>
+              <w:spacing w:after="0" w:line="264"/>
+            </w:pPr>
+            <w:r>
+              <w:rPr>
+                <w:rFonts w:ascii="Calibri" w:cs="Calibri" w:eastAsia="Calibri" w:hAnsi="Calibri"/>
+                <w:color w:val="232B3D"/>
+                <w:sz w:val="20"/>
+                <w:szCs w:val="20"/>
+              </w:rPr>
+              <w:t xml:space="preserve">Oficios recibidos por día</w:t>
+            </w:r>
+          </w:p>
+        </w:tc>
+        <w:tc>
+          <w:tcPr>
+            <w:tcW w:type="dxa" w:w="6260"/>
+            <w:shd w:fill="FFFFFF" w:val="clear"/>
+            <w:tcMar>
+              <w:top w:type="dxa" w:w="80"/>
+              <w:left w:type="dxa" w:w="120"/>
+              <w:bottom w:type="dxa" w:w="80"/>
+              <w:right w:type="dxa" w:w="120"/>
+            </w:tcMar>
+          </w:tcPr>
+          <w:p>
+            <w:pPr>
+              <w:keepNext/>
+              <w:spacing w:after="0" w:line="264"/>
+              <w:jc w:val="center"/>
+            </w:pPr>
+            <w:r>
+              <w:rPr>
+                <w:rFonts w:ascii="Calibri" w:cs="Calibri" w:eastAsia="Calibri" w:hAnsi="Calibri"/>
+                <w:color w:val="232B3D"/>
+                <w:sz w:val="20"/>
+                <w:szCs w:val="20"/>
+              </w:rPr>
+              <w:t xml:space="preserve">Los últimos catorce días</w:t>
+            </w:r>
+          </w:p>
+        </w:tc>
+      </w:tr>
+      <w:tr>
+        <w:trPr>
+          <w:cantSplit/>
+        </w:trPr>
+        <w:tc>
+          <w:tcPr>
+            <w:tcW w:type="dxa" w:w="3100"/>
+            <w:shd w:fill="F7F8FA" w:val="clear"/>
+            <w:tcMar>
+              <w:top w:type="dxa" w:w="80"/>
+              <w:left w:type="dxa" w:w="120"/>
+              <w:bottom w:type="dxa" w:w="80"/>
+              <w:right w:type="dxa" w:w="120"/>
+            </w:tcMar>
+          </w:tcPr>
+          <w:p>
+            <w:pPr>
+              <w:keepNext/>
+              <w:spacing w:after="0" w:line="264"/>
+            </w:pPr>
+            <w:r>
+              <w:rPr>
+                <w:rFonts w:ascii="Calibri" w:cs="Calibri" w:eastAsia="Calibri" w:hAnsi="Calibri"/>
+                <w:color w:val="232B3D"/>
+                <w:sz w:val="20"/>
+                <w:szCs w:val="20"/>
+              </w:rPr>
+              <w:t xml:space="preserve">Distribución por estado</w:t>
+            </w:r>
+          </w:p>
+        </w:tc>
+        <w:tc>
+          <w:tcPr>
+            <w:tcW w:type="dxa" w:w="6260"/>
+            <w:shd w:fill="F7F8FA" w:val="clear"/>
+            <w:tcMar>
+              <w:top w:type="dxa" w:w="80"/>
+              <w:left w:type="dxa" w:w="120"/>
+              <w:bottom w:type="dxa" w:w="80"/>
+              <w:right w:type="dxa" w:w="120"/>
+            </w:tcMar>
+          </w:tcPr>
+          <w:p>
+            <w:pPr>
+              <w:keepNext/>
+              <w:spacing w:after="0" w:line="264"/>
+              <w:jc w:val="center"/>
+            </w:pPr>
+            <w:r>
+              <w:rPr>
+                <w:rFonts w:ascii="Calibri" w:cs="Calibri" w:eastAsia="Calibri" w:hAnsi="Calibri"/>
+                <w:color w:val="232B3D"/>
+                <w:sz w:val="20"/>
+                <w:szCs w:val="20"/>
+              </w:rPr>
+              <w:t xml:space="preserve">Proporción de cada estado sobre el total</w:t>
+            </w:r>
+          </w:p>
+        </w:tc>
+      </w:tr>
+      <w:tr>
+        <w:trPr>
+          <w:cantSplit/>
+        </w:trPr>
+        <w:tc>
+          <w:tcPr>
+            <w:tcW w:type="dxa" w:w="3100"/>
+            <w:shd w:fill="FFFFFF" w:val="clear"/>
+            <w:tcMar>
+              <w:top w:type="dxa" w:w="80"/>
+              <w:left w:type="dxa" w:w="120"/>
+              <w:bottom w:type="dxa" w:w="80"/>
+              <w:right w:type="dxa" w:w="120"/>
+            </w:tcMar>
+          </w:tcPr>
+          <w:p>
+            <w:pPr>
+              <w:keepNext/>
+              <w:spacing w:after="0" w:line="264"/>
+            </w:pPr>
+            <w:r>
+              <w:rPr>
+                <w:rFonts w:ascii="Calibri" w:cs="Calibri" w:eastAsia="Calibri" w:hAnsi="Calibri"/>
+                <w:color w:val="232B3D"/>
+                <w:sz w:val="20"/>
+                <w:szCs w:val="20"/>
+              </w:rPr>
+              <w:t xml:space="preserve">Oficios por responsable</w:t>
+            </w:r>
+          </w:p>
+        </w:tc>
+        <w:tc>
+          <w:tcPr>
+            <w:tcW w:type="dxa" w:w="6260"/>
+            <w:shd w:fill="FFFFFF" w:val="clear"/>
+            <w:tcMar>
+              <w:top w:type="dxa" w:w="80"/>
+              <w:left w:type="dxa" w:w="120"/>
+              <w:bottom w:type="dxa" w:w="80"/>
+              <w:right w:type="dxa" w:w="120"/>
+            </w:tcMar>
+          </w:tcPr>
+          <w:p>
+            <w:pPr>
+              <w:keepNext/>
+              <w:spacing w:after="0" w:line="264"/>
+              <w:jc w:val="center"/>
+            </w:pPr>
+            <w:r>
+              <w:rPr>
+                <w:rFonts w:ascii="Calibri" w:cs="Calibri" w:eastAsia="Calibri" w:hAnsi="Calibri"/>
+                <w:color w:val="232B3D"/>
+                <w:sz w:val="20"/>
+                <w:szCs w:val="20"/>
+              </w:rPr>
+              <w:t xml:space="preserve">Carga de trabajo de cada persona</w:t>
+            </w:r>
+          </w:p>
+        </w:tc>
+      </w:tr>
+      <w:tr>
+        <w:trPr>
+          <w:cantSplit/>
+        </w:trPr>
+        <w:tc>
+          <w:tcPr>
+            <w:tcW w:type="dxa" w:w="3100"/>
+            <w:shd w:fill="F7F8FA" w:val="clear"/>
+            <w:tcMar>
+              <w:top w:type="dxa" w:w="80"/>
+              <w:left w:type="dxa" w:w="120"/>
+              <w:bottom w:type="dxa" w:w="80"/>
+              <w:right w:type="dxa" w:w="120"/>
+            </w:tcMar>
+          </w:tcPr>
+          <w:p>
+            <w:pPr>
+              <w:keepNext/>
+              <w:spacing w:after="0" w:line="264"/>
+            </w:pPr>
+            <w:r>
+              <w:rPr>
+                <w:rFonts w:ascii="Calibri" w:cs="Calibri" w:eastAsia="Calibri" w:hAnsi="Calibri"/>
+                <w:color w:val="232B3D"/>
+                <w:sz w:val="20"/>
+                <w:szCs w:val="20"/>
+              </w:rPr>
+              <w:t xml:space="preserve">Oficios recibidos por mes</w:t>
+            </w:r>
+          </w:p>
+        </w:tc>
+        <w:tc>
+          <w:tcPr>
+            <w:tcW w:type="dxa" w:w="6260"/>
+            <w:shd w:fill="F7F8FA" w:val="clear"/>
+            <w:tcMar>
+              <w:top w:type="dxa" w:w="80"/>
+              <w:left w:type="dxa" w:w="120"/>
+              <w:bottom w:type="dxa" w:w="80"/>
+              <w:right w:type="dxa" w:w="120"/>
+            </w:tcMar>
+          </w:tcPr>
+          <w:p>
+            <w:pPr>
+              <w:keepNext/>
+              <w:spacing w:after="0" w:line="264"/>
+              <w:jc w:val="center"/>
+            </w:pPr>
+            <w:r>
+              <w:rPr>
+                <w:rFonts w:ascii="Calibri" w:cs="Calibri" w:eastAsia="Calibri" w:hAnsi="Calibri"/>
+                <w:color w:val="232B3D"/>
+                <w:sz w:val="20"/>
+                <w:szCs w:val="20"/>
+              </w:rPr>
+              <w:t xml:space="preserve">Los últimos seis meses</w:t>
+            </w:r>
+          </w:p>
+        </w:tc>
+      </w:tr>
+      <w:tr>
+        <w:trPr>
+          <w:cantSplit/>
+        </w:trPr>
+        <w:tc>
+          <w:tcPr>
+            <w:tcW w:type="dxa" w:w="3100"/>
+            <w:shd w:fill="FFFFFF" w:val="clear"/>
+            <w:tcMar>
+              <w:top w:type="dxa" w:w="80"/>
+              <w:left w:type="dxa" w:w="120"/>
+              <w:bottom w:type="dxa" w:w="80"/>
+              <w:right w:type="dxa" w:w="120"/>
+            </w:tcMar>
+          </w:tcPr>
+          <w:p>
+            <w:pPr>
+              <w:keepNext w:val="false"/>
+              <w:spacing w:after="0" w:line="264"/>
+            </w:pPr>
+            <w:r>
+              <w:rPr>
+                <w:rFonts w:ascii="Calibri" w:cs="Calibri" w:eastAsia="Calibri" w:hAnsi="Calibri"/>
+                <w:color w:val="232B3D"/>
+                <w:sz w:val="20"/>
+                <w:szCs w:val="20"/>
+              </w:rPr>
+              <w:t xml:space="preserve">Personas investigadas por mes</w:t>
+            </w:r>
+          </w:p>
+        </w:tc>
+        <w:tc>
+          <w:tcPr>
+            <w:tcW w:type="dxa" w:w="6260"/>
+            <w:shd w:fill="FFFFFF" w:val="clear"/>
+            <w:tcMar>
+              <w:top w:type="dxa" w:w="80"/>
+              <w:left w:type="dxa" w:w="120"/>
+              <w:bottom w:type="dxa" w:w="80"/>
+              <w:right w:type="dxa" w:w="120"/>
+            </w:tcMar>
+          </w:tcPr>
+          <w:p>
+            <w:pPr>
+              <w:keepNext w:val="false"/>
+              <w:spacing w:after="0" w:line="264"/>
+              <w:jc w:val="center"/>
+            </w:pPr>
+            <w:r>
+              <w:rPr>
+                <w:rFonts w:ascii="Calibri" w:cs="Calibri" w:eastAsia="Calibri" w:hAnsi="Calibri"/>
+                <w:color w:val="232B3D"/>
+                <w:sz w:val="20"/>
+                <w:szCs w:val="20"/>
+              </w:rPr>
+              <w:t xml:space="preserve">Los últimos seis meses. La barra corresponde a las personas y en su interior se indica de cuántos oficios proceden</w:t>
+            </w:r>
+          </w:p>
+        </w:tc>
+      </w:tr>
+    </w:tbl>
+    <w:p>
+      <w:pPr>
+        <w:spacing w:after="200"/>
+      </w:pPr>
+    </w:p>
+    <w:p>
+      <w:pPr>
+        <w:spacing w:after="120" w:line="276"/>
+      </w:pPr>
+      <w:r>
+        <w:rPr>
+          <w:rFonts w:ascii="Calibri" w:cs="Calibri" w:eastAsia="Calibri" w:hAnsi="Calibri"/>
+          <w:color w:val="232B3D"/>
+          <w:sz w:val="22"/>
+          <w:szCs w:val="22"/>
+        </w:rPr>
+        <w:t xml:space="preserve">Para el rol Usuario, el tablero considera únicamente sus propios oficios.</w:t>
+      </w:r>
+    </w:p>
+    <w:p>
+      <w:pPr>
+        <w:pStyle w:val="Heading3"/>
+        <w:spacing w:after="100" w:before="200"/>
+      </w:pPr>
+      <w:r>
+        <w:rPr>
+          <w:rFonts w:ascii="Calibri" w:cs="Calibri" w:eastAsia="Calibri" w:hAnsi="Calibri"/>
+          <w:b/>
+          <w:bCs/>
+          <w:color w:val="5A6B8C"/>
+          <w:sz w:val="23"/>
+          <w:szCs w:val="23"/>
+        </w:rPr>
+        <w:t xml:space="preserve">Filtros del tablero</w:t>
+      </w:r>
+    </w:p>
+    <w:p>
+      <w:pPr>
+        <w:spacing w:after="120" w:line="276"/>
+      </w:pPr>
+      <w:r>
+        <w:rPr>
+          <w:rFonts w:ascii="Calibri" w:cs="Calibri" w:eastAsia="Calibri" w:hAnsi="Calibri"/>
+          <w:color w:val="232B3D"/>
+          <w:sz w:val="22"/>
+          <w:szCs w:val="22"/>
+        </w:rPr>
+        <w:t xml:space="preserve">El panel Filtros del tablero acota lo que presentan las tarjetas y los cinco gráficos a la vez: al elegir un criterio, el tablero completo se recalcula.</w:t>
+      </w:r>
+    </w:p>
+    <w:p>
+      <w:pPr>
+        <w:pStyle w:val="ListParagraph"/>
+        <w:numPr>
+          <w:ilvl w:val="0"/>
+          <w:numId w:val="4"/>
+        </w:numPr>
+        <w:spacing w:after="80" w:line="276"/>
+      </w:pPr>
+      <w:r>
+        <w:rPr>
+          <w:rFonts w:ascii="Calibri" w:cs="Calibri" w:eastAsia="Calibri" w:hAnsi="Calibri"/>
+          <w:color w:val="232B3D"/>
+          <w:sz w:val="22"/>
+          <w:szCs w:val="22"/>
+        </w:rPr>
+        <w:t xml:space="preserve">Institución del Estado, Tipo de acción, Estado y Prioridad.</w:t>
+      </w:r>
+    </w:p>
+    <w:p>
+      <w:pPr>
+        <w:pStyle w:val="ListParagraph"/>
+        <w:numPr>
+          <w:ilvl w:val="0"/>
+          <w:numId w:val="4"/>
+        </w:numPr>
+        <w:spacing w:after="80" w:line="276"/>
+      </w:pPr>
+      <w:r>
+        <w:rPr>
+          <w:rFonts w:ascii="Calibri" w:cs="Calibri" w:eastAsia="Calibri" w:hAnsi="Calibri"/>
+          <w:color w:val="232B3D"/>
+          <w:sz w:val="22"/>
+          <w:szCs w:val="22"/>
+        </w:rPr>
+        <w:t xml:space="preserve">Responsable, únicamente para administradores y superusuario.</w:t>
+      </w:r>
+    </w:p>
+    <w:p>
+      <w:pPr>
+        <w:pStyle w:val="ListParagraph"/>
+        <w:numPr>
+          <w:ilvl w:val="0"/>
+          <w:numId w:val="4"/>
+        </w:numPr>
+        <w:spacing w:after="80" w:line="276"/>
+      </w:pPr>
+      <w:r>
+        <w:rPr>
+          <w:rFonts w:ascii="Calibri" w:cs="Calibri" w:eastAsia="Calibri" w:hAnsi="Calibri"/>
+          <w:color w:val="232B3D"/>
+          <w:sz w:val="22"/>
+          <w:szCs w:val="22"/>
+        </w:rPr>
+        <w:t xml:space="preserve">Un rango de fecha de recepción, con los campos desde y hasta.</w:t>
+      </w:r>
+    </w:p>
+    <w:p>
+      <w:pPr>
+        <w:spacing w:after="120" w:line="276"/>
+      </w:pPr>
+      <w:r>
+        <w:rPr>
+          <w:rFonts w:ascii="Calibri" w:cs="Calibri" w:eastAsia="Calibri" w:hAnsi="Calibri"/>
+          <w:color w:val="232B3D"/>
+          <w:sz w:val="22"/>
+          <w:szCs w:val="22"/>
+        </w:rPr>
+        <w:t xml:space="preserve">La opción (Todos) deja de filtrar por ese campo y el botón Limpiar filtros los restablece todos. Cuando hay algún filtro aplicado, la esquina derecha del panel indica cuántos oficios se están considerando del total.</w:t>
       </w:r>
     </w:p>
     <w:p>
@@ -9524,6 +10353,68 @@
           <w:sz w:val="23"/>
           <w:szCs w:val="23"/>
         </w:rPr>
+        <w:t xml:space="preserve">La aplicación no acepta la identificación que registro</w:t>
+      </w:r>
+    </w:p>
+    <w:p>
+      <w:pPr>
+        <w:spacing w:after="120" w:line="276"/>
+      </w:pPr>
+      <w:r>
+        <w:rPr>
+          <w:rFonts w:ascii="Calibri" w:cs="Calibri" w:eastAsia="Calibri" w:hAnsi="Calibri"/>
+          <w:color w:val="232B3D"/>
+          <w:sz w:val="22"/>
+          <w:szCs w:val="22"/>
+        </w:rPr>
+        <w:t xml:space="preserve">Cada documento tiene su formato: la cédula, 10 dígitos; el RUC, 13; y el pasaporte, letras y números. El mensaje indica cuántos dígitos se registraron. Los puntos, guiones y espacios no suponen inconveniente: la aplicación los retira.</w:t>
+      </w:r>
+    </w:p>
+    <w:p>
+      <w:pPr>
+        <w:pStyle w:val="Heading3"/>
+        <w:spacing w:after="100" w:before="200"/>
+      </w:pPr>
+      <w:r>
+        <w:rPr>
+          <w:rFonts w:ascii="Calibri" w:cs="Calibri" w:eastAsia="Calibri" w:hAnsi="Calibri"/>
+          <w:b/>
+          <w:bCs/>
+          <w:color w:val="5A6B8C"/>
+          <w:sz w:val="23"/>
+          <w:szCs w:val="23"/>
+        </w:rPr>
+        <w:t xml:space="preserve">El tablero no presenta todos los oficios</w:t>
+      </w:r>
+    </w:p>
+    <w:p>
+      <w:pPr>
+        <w:spacing w:after="120" w:line="276"/>
+      </w:pPr>
+      <w:r>
+        <w:rPr>
+          <w:rFonts w:ascii="Calibri" w:cs="Calibri" w:eastAsia="Calibri" w:hAnsi="Calibri"/>
+          <w:color w:val="232B3D"/>
+          <w:sz w:val="22"/>
+          <w:szCs w:val="22"/>
+        </w:rPr>
+        <w:t xml:space="preserve">Es posible que se encuentre aplicado algún filtro del tablero. El botón Limpiar filtros los restablece; mientras haya alguno activo, el panel indica cuántos oficios se están considerando del total.</w:t>
+      </w:r>
+    </w:p>
+    <w:p>
+      <w:pPr>
+        <w:pStyle w:val="Heading3"/>
+        <w:spacing w:after="100" w:before="200"/>
+      </w:pPr>
+      <w:r>
+        <w:rPr>
+          <w:rFonts w:ascii="Calibri" w:cs="Calibri" w:eastAsia="Calibri" w:hAnsi="Calibri"/>
+          <w:b/>
+          <w:bCs/>
+          <w:color w:val="5A6B8C"/>
+          <w:sz w:val="23"/>
+          <w:szCs w:val="23"/>
+        </w:rPr>
         <w:t xml:space="preserve">El tipo de acción que necesito no figura en el desplegable</w:t>
       </w:r>
     </w:p>
@@ -9885,7 +10776,7 @@
         <w:sz w:val="16"/>
         <w:szCs w:val="16"/>
       </w:rPr>
-      <w:t xml:space="preserve">Manual de usuario · Versión 2.0 · 13 de agosto de 2026  |  Aplicación versión 1.0</w:t>
+      <w:t xml:space="preserve">Manual de usuario · Versión 2.1 · 18 de agosto de 2026  |  Aplicación versión 1.0</w:t>
     </w:r>
     <w:r>
       <w:rPr>

</xml_diff>